<commit_message>
Ship PWA/theme UI, putyovka/doverennost docs, and document payment fixes.
Fix empty-date validation, doverennost trailer mapping, payment notes overwriting doc notes, and orphaned payments on delete.

Co-authored-by: Cursor <cursoragent@cursor.com>
</commit_message>
<xml_diff>
--- a/backend/templates/blanka.docx
+++ b/backend/templates/blanka.docx
@@ -1,6 +1,6 @@
 
 <file path=word/document.xml><?xml version="1.0" encoding="utf-8"?>
-<w:document xmlns:wpc="http://schemas.microsoft.com/office/word/2010/wordprocessingCanvas" xmlns:cx="http://schemas.microsoft.com/office/drawing/2014/chartex" xmlns:mc="http://schemas.openxmlformats.org/markup-compatibility/2006" xmlns:o="urn:schemas-microsoft-com:office:office" xmlns:r="http://schemas.openxmlformats.org/officeDocument/2006/relationships" xmlns:m="http://schemas.openxmlformats.org/officeDocument/2006/math" xmlns:v="urn:schemas-microsoft-com:vml" xmlns:wp14="http://schemas.microsoft.com/office/word/2010/wordprocessingDrawing" xmlns:wp="http://schemas.openxmlformats.org/drawingml/2006/wordprocessingDrawing" xmlns:w10="urn:schemas-microsoft-com:office:word" xmlns:w="http://schemas.openxmlformats.org/wordprocessingml/2006/main" xmlns:w14="http://schemas.microsoft.com/office/word/2010/wordml" xmlns:w15="http://schemas.microsoft.com/office/word/2012/wordml" xmlns:w16se="http://schemas.microsoft.com/office/word/2015/wordml/symex" xmlns:wpg="http://schemas.microsoft.com/office/word/2010/wordprocessingGroup" xmlns:wpi="http://schemas.microsoft.com/office/word/2010/wordprocessingInk" xmlns:wne="http://schemas.microsoft.com/office/word/2006/wordml" xmlns:wps="http://schemas.microsoft.com/office/word/2010/wordprocessingShape" mc:Ignorable="w14 w15 w16se wp14">
+<w:document xmlns:wpc="http://schemas.microsoft.com/office/word/2010/wordprocessingCanvas" xmlns:cx="http://schemas.microsoft.com/office/drawing/2014/chartex" xmlns:cx1="http://schemas.microsoft.com/office/drawing/2015/9/8/chartex" xmlns:cx2="http://schemas.microsoft.com/office/drawing/2015/10/21/chartex" xmlns:cx3="http://schemas.microsoft.com/office/drawing/2016/5/9/chartex" xmlns:cx4="http://schemas.microsoft.com/office/drawing/2016/5/10/chartex" xmlns:cx5="http://schemas.microsoft.com/office/drawing/2016/5/11/chartex" xmlns:cx6="http://schemas.microsoft.com/office/drawing/2016/5/12/chartex" xmlns:cx7="http://schemas.microsoft.com/office/drawing/2016/5/13/chartex" xmlns:cx8="http://schemas.microsoft.com/office/drawing/2016/5/14/chartex" xmlns:mc="http://schemas.openxmlformats.org/markup-compatibility/2006" xmlns:aink="http://schemas.microsoft.com/office/drawing/2016/ink" xmlns:am3d="http://schemas.microsoft.com/office/drawing/2017/model3d" xmlns:o="urn:schemas-microsoft-com:office:office" xmlns:r="http://schemas.openxmlformats.org/officeDocument/2006/relationships" xmlns:m="http://schemas.openxmlformats.org/officeDocument/2006/math" xmlns:v="urn:schemas-microsoft-com:vml" xmlns:wp14="http://schemas.microsoft.com/office/word/2010/wordprocessingDrawing" xmlns:wp="http://schemas.openxmlformats.org/drawingml/2006/wordprocessingDrawing" xmlns:w10="urn:schemas-microsoft-com:office:word" xmlns:w="http://schemas.openxmlformats.org/wordprocessingml/2006/main" xmlns:w14="http://schemas.microsoft.com/office/word/2010/wordml" xmlns:w15="http://schemas.microsoft.com/office/word/2012/wordml" xmlns:w16cex="http://schemas.microsoft.com/office/word/2018/wordml/cex" xmlns:w16cid="http://schemas.microsoft.com/office/word/2016/wordml/cid" xmlns:w16="http://schemas.microsoft.com/office/word/2018/wordml" xmlns:w16se="http://schemas.microsoft.com/office/word/2015/wordml/symex" xmlns:wpg="http://schemas.microsoft.com/office/word/2010/wordprocessingGroup" xmlns:wpi="http://schemas.microsoft.com/office/word/2010/wordprocessingInk" xmlns:wne="http://schemas.microsoft.com/office/word/2006/wordml" xmlns:wps="http://schemas.microsoft.com/office/word/2010/wordprocessingShape" mc:Ignorable="w14 w15 w16se w16cid w16 w16cex wp14">
   <w:body>
     <w:p>
       <w:pPr>
@@ -35,6 +35,7 @@
         <w:rPr>
           <w:rFonts w:ascii="Times New Roman" w:hAnsi="Times New Roman"/>
           <w:b/>
+          <w:color w:val="FF0000"/>
           <w:sz w:val="28"/>
           <w:szCs w:val="28"/>
         </w:rPr>
@@ -44,9 +45,9 @@
         <w:rPr>
           <w:rFonts w:ascii="Times New Roman" w:hAnsi="Times New Roman"/>
           <w:b/>
-          <w:sz w:val="28"/>
-          <w:szCs w:val="28"/>
-          <w:lang w:val="en-US"/>
+          <w:color w:val="FF0000"/>
+          <w:sz w:val="28"/>
+          <w:szCs w:val="28"/>
         </w:rPr>
         <w:t>9</w:t>
       </w:r>
@@ -54,6 +55,7 @@
         <w:rPr>
           <w:rFonts w:ascii="Times New Roman" w:hAnsi="Times New Roman"/>
           <w:b/>
+          <w:color w:val="FF0000"/>
           <w:sz w:val="28"/>
           <w:szCs w:val="28"/>
           <w:lang w:val="uz-Cyrl-UZ"/>
@@ -64,6 +66,7 @@
         <w:rPr>
           <w:rFonts w:ascii="Times New Roman" w:hAnsi="Times New Roman"/>
           <w:b/>
+          <w:color w:val="FF0000"/>
           <w:sz w:val="28"/>
           <w:szCs w:val="28"/>
         </w:rPr>
@@ -159,6 +162,7 @@
         </w:rPr>
         <w:t>г.</w:t>
       </w:r>
+      <w:proofErr w:type="spellStart"/>
       <w:r>
         <w:rPr>
           <w:rFonts w:ascii="Times New Roman" w:hAnsi="Times New Roman"/>
@@ -168,6 +172,7 @@
         </w:rPr>
         <w:t>Дангара</w:t>
       </w:r>
+      <w:proofErr w:type="spellEnd"/>
     </w:p>
     <w:p>
       <w:pPr>
@@ -344,13 +349,23 @@
         </w:rPr>
         <w:t xml:space="preserve">в лице председателя </w:t>
       </w:r>
-      <w:r>
-        <w:rPr>
-          <w:rFonts w:ascii="Times New Roman" w:hAnsi="Times New Roman"/>
-          <w:sz w:val="28"/>
-          <w:szCs w:val="28"/>
-        </w:rPr>
-        <w:t>Мамажонов .Б</w:t>
+      <w:proofErr w:type="spellStart"/>
+      <w:r>
+        <w:rPr>
+          <w:rFonts w:ascii="Times New Roman" w:hAnsi="Times New Roman"/>
+          <w:sz w:val="28"/>
+          <w:szCs w:val="28"/>
+        </w:rPr>
+        <w:t>Мамажонов</w:t>
+      </w:r>
+      <w:proofErr w:type="spellEnd"/>
+      <w:r>
+        <w:rPr>
+          <w:rFonts w:ascii="Times New Roman" w:hAnsi="Times New Roman"/>
+          <w:sz w:val="28"/>
+          <w:szCs w:val="28"/>
+        </w:rPr>
+        <w:t xml:space="preserve"> .Б</w:t>
       </w:r>
       <w:r>
         <w:rPr>
@@ -413,6 +428,7 @@
         <w:rPr>
           <w:rFonts w:ascii="Times New Roman" w:hAnsi="Times New Roman"/>
           <w:b/>
+          <w:color w:val="FF0000"/>
           <w:sz w:val="28"/>
           <w:szCs w:val="28"/>
           <w:lang w:val="en-US"/>
@@ -423,6 +439,7 @@
         <w:rPr>
           <w:rFonts w:ascii="Times New Roman" w:hAnsi="Times New Roman"/>
           <w:b/>
+          <w:color w:val="FF0000"/>
           <w:sz w:val="28"/>
           <w:szCs w:val="28"/>
         </w:rPr>
@@ -432,6 +449,7 @@
         <w:rPr>
           <w:rFonts w:ascii="Times New Roman" w:hAnsi="Times New Roman"/>
           <w:b/>
+          <w:color w:val="FF0000"/>
           <w:sz w:val="28"/>
           <w:szCs w:val="28"/>
           <w:lang w:val="en-US"/>
@@ -442,6 +460,7 @@
         <w:rPr>
           <w:rFonts w:ascii="Times New Roman" w:hAnsi="Times New Roman"/>
           <w:b/>
+          <w:color w:val="FF0000"/>
           <w:sz w:val="28"/>
           <w:szCs w:val="28"/>
         </w:rPr>
@@ -451,6 +470,7 @@
         <w:rPr>
           <w:rFonts w:ascii="Times New Roman" w:hAnsi="Times New Roman"/>
           <w:b/>
+          <w:color w:val="FF0000"/>
           <w:sz w:val="28"/>
           <w:szCs w:val="28"/>
           <w:lang w:val="en-US"/>
@@ -716,8 +736,18 @@
           <w:sz w:val="28"/>
           <w:szCs w:val="28"/>
         </w:rPr>
-        <w:t>, путевой лист) и необходимой информацией, касающейся данной перевозки .</w:t>
-      </w:r>
+        <w:t xml:space="preserve">, путевой лист) и необходимой информацией, касающейся данной </w:t>
+      </w:r>
+      <w:proofErr w:type="gramStart"/>
+      <w:r>
+        <w:rPr>
+          <w:rFonts w:ascii="Times New Roman" w:hAnsi="Times New Roman"/>
+          <w:sz w:val="28"/>
+          <w:szCs w:val="28"/>
+        </w:rPr>
+        <w:t>перевозки .</w:t>
+      </w:r>
+      <w:proofErr w:type="gramEnd"/>
     </w:p>
     <w:p>
       <w:pPr>
@@ -781,6 +811,7 @@
         </w:rPr>
         <w:t>- Производить оплату труда «</w:t>
       </w:r>
+      <w:proofErr w:type="gramStart"/>
       <w:r>
         <w:rPr>
           <w:rFonts w:ascii="Times New Roman" w:hAnsi="Times New Roman"/>
@@ -796,7 +827,16 @@
           <w:sz w:val="28"/>
           <w:szCs w:val="28"/>
         </w:rPr>
-        <w:t>»  за месяц или за каждую отдельную перевозку  на договорной основе. Сумма будет зависеть от расстояния перевозки и других специфических условий.</w:t>
+        <w:t>»  за</w:t>
+      </w:r>
+      <w:proofErr w:type="gramEnd"/>
+      <w:r>
+        <w:rPr>
+          <w:rFonts w:ascii="Times New Roman" w:hAnsi="Times New Roman"/>
+          <w:sz w:val="28"/>
+          <w:szCs w:val="28"/>
+        </w:rPr>
+        <w:t xml:space="preserve"> месяц или за каждую отдельную перевозку  на договорной основе. Сумма будет зависеть от расстояния перевозки и других специфических условий.</w:t>
       </w:r>
     </w:p>
     <w:p>
@@ -859,7 +899,25 @@
           <w:sz w:val="28"/>
           <w:szCs w:val="28"/>
         </w:rPr>
-        <w:t>- Выдавать  доверенность «</w:t>
+        <w:t xml:space="preserve">- </w:t>
+      </w:r>
+      <w:proofErr w:type="gramStart"/>
+      <w:r>
+        <w:rPr>
+          <w:rFonts w:ascii="Times New Roman" w:hAnsi="Times New Roman"/>
+          <w:sz w:val="28"/>
+          <w:szCs w:val="28"/>
+        </w:rPr>
+        <w:t>Выдавать  доверенность</w:t>
+      </w:r>
+      <w:proofErr w:type="gramEnd"/>
+      <w:r>
+        <w:rPr>
+          <w:rFonts w:ascii="Times New Roman" w:hAnsi="Times New Roman"/>
+          <w:sz w:val="28"/>
+          <w:szCs w:val="28"/>
+        </w:rPr>
+        <w:t xml:space="preserve"> «</w:t>
       </w:r>
       <w:r>
         <w:rPr>
@@ -962,7 +1020,25 @@
           <w:sz w:val="28"/>
           <w:szCs w:val="28"/>
         </w:rPr>
-        <w:t xml:space="preserve">- Обеспечивать сохранность грузов, книжки МДП и других  сопроводительных документов. </w:t>
+        <w:t xml:space="preserve">- Обеспечивать сохранность грузов, книжки МДП и </w:t>
+      </w:r>
+      <w:proofErr w:type="gramStart"/>
+      <w:r>
+        <w:rPr>
+          <w:rFonts w:ascii="Times New Roman" w:hAnsi="Times New Roman"/>
+          <w:sz w:val="28"/>
+          <w:szCs w:val="28"/>
+        </w:rPr>
+        <w:t>других  сопроводительных</w:t>
+      </w:r>
+      <w:proofErr w:type="gramEnd"/>
+      <w:r>
+        <w:rPr>
+          <w:rFonts w:ascii="Times New Roman" w:hAnsi="Times New Roman"/>
+          <w:sz w:val="28"/>
+          <w:szCs w:val="28"/>
+        </w:rPr>
+        <w:t xml:space="preserve"> документов. </w:t>
       </w:r>
     </w:p>
     <w:p>
@@ -985,7 +1061,25 @@
           <w:sz w:val="28"/>
           <w:szCs w:val="28"/>
         </w:rPr>
-        <w:t>- Обеспечивать контроль за правильным  заполнением таможенными органами Всех реквизитов книжки МДП, наличием печати и движением отрывных листов.</w:t>
+        <w:t xml:space="preserve">- Обеспечивать контроль за </w:t>
+      </w:r>
+      <w:proofErr w:type="gramStart"/>
+      <w:r>
+        <w:rPr>
+          <w:rFonts w:ascii="Times New Roman" w:hAnsi="Times New Roman"/>
+          <w:sz w:val="28"/>
+          <w:szCs w:val="28"/>
+        </w:rPr>
+        <w:t>правильным  заполнением</w:t>
+      </w:r>
+      <w:proofErr w:type="gramEnd"/>
+      <w:r>
+        <w:rPr>
+          <w:rFonts w:ascii="Times New Roman" w:hAnsi="Times New Roman"/>
+          <w:sz w:val="28"/>
+          <w:szCs w:val="28"/>
+        </w:rPr>
+        <w:t xml:space="preserve"> таможенными органами Всех реквизитов книжки МДП, наличием печати и движением отрывных листов.</w:t>
       </w:r>
     </w:p>
     <w:p>
@@ -1025,8 +1119,18 @@
           <w:sz w:val="28"/>
           <w:szCs w:val="28"/>
         </w:rPr>
-        <w:t>» (в течении двух недель после завершения рейса) .</w:t>
-      </w:r>
+        <w:t>» (в течении двух недель после завершения рейса</w:t>
+      </w:r>
+      <w:proofErr w:type="gramStart"/>
+      <w:r>
+        <w:rPr>
+          <w:rFonts w:ascii="Times New Roman" w:hAnsi="Times New Roman"/>
+          <w:sz w:val="28"/>
+          <w:szCs w:val="28"/>
+        </w:rPr>
+        <w:t>) .</w:t>
+      </w:r>
+      <w:proofErr w:type="gramEnd"/>
     </w:p>
     <w:p>
       <w:pPr>
@@ -1048,8 +1152,18 @@
           <w:sz w:val="28"/>
           <w:szCs w:val="28"/>
         </w:rPr>
-        <w:t>2.3 Никогда не перевозить алкогольные или табачные изделия за исключением пива, вина или табака, или в случаи дорожной аварии, или утери перевозимого груза  «</w:t>
-      </w:r>
+        <w:t xml:space="preserve">2.3 Никогда не перевозить алкогольные или табачные изделия за исключением пива, вина или табака, или в случаи дорожной аварии, или утери перевозимого </w:t>
+      </w:r>
+      <w:proofErr w:type="gramStart"/>
+      <w:r>
+        <w:rPr>
+          <w:rFonts w:ascii="Times New Roman" w:hAnsi="Times New Roman"/>
+          <w:sz w:val="28"/>
+          <w:szCs w:val="28"/>
+        </w:rPr>
+        <w:t>груза  «</w:t>
+      </w:r>
+      <w:proofErr w:type="gramEnd"/>
       <w:r>
         <w:rPr>
           <w:rFonts w:ascii="Times New Roman" w:hAnsi="Times New Roman"/>
@@ -1120,17 +1234,86 @@
           <w:b/>
           <w:sz w:val="28"/>
           <w:szCs w:val="28"/>
-        </w:rPr>
-      </w:pPr>
-      <w:r>
-        <w:rPr>
-          <w:rFonts w:ascii="Times New Roman" w:hAnsi="Times New Roman"/>
-          <w:b/>
-          <w:sz w:val="28"/>
-          <w:szCs w:val="28"/>
           <w:lang w:val="en-US"/>
         </w:rPr>
-        <w:lastRenderedPageBreak/>
+      </w:pPr>
+    </w:p>
+    <w:p>
+      <w:pPr>
+        <w:tabs>
+          <w:tab w:val="left" w:pos="2620"/>
+        </w:tabs>
+        <w:spacing w:after="0" w:line="240" w:lineRule="auto"/>
+        <w:ind w:left="360"/>
+        <w:jc w:val="center"/>
+        <w:rPr>
+          <w:rFonts w:ascii="Times New Roman" w:hAnsi="Times New Roman"/>
+          <w:b/>
+          <w:sz w:val="28"/>
+          <w:szCs w:val="28"/>
+          <w:lang w:val="en-US"/>
+        </w:rPr>
+      </w:pPr>
+    </w:p>
+    <w:p>
+      <w:pPr>
+        <w:tabs>
+          <w:tab w:val="left" w:pos="2620"/>
+        </w:tabs>
+        <w:spacing w:after="0" w:line="240" w:lineRule="auto"/>
+        <w:ind w:left="360"/>
+        <w:jc w:val="center"/>
+        <w:rPr>
+          <w:rFonts w:ascii="Times New Roman" w:hAnsi="Times New Roman"/>
+          <w:b/>
+          <w:sz w:val="28"/>
+          <w:szCs w:val="28"/>
+          <w:lang w:val="en-US"/>
+        </w:rPr>
+      </w:pPr>
+    </w:p>
+    <w:p>
+      <w:pPr>
+        <w:tabs>
+          <w:tab w:val="left" w:pos="2620"/>
+        </w:tabs>
+        <w:spacing w:after="0" w:line="240" w:lineRule="auto"/>
+        <w:ind w:left="360"/>
+        <w:jc w:val="center"/>
+        <w:rPr>
+          <w:rFonts w:ascii="Times New Roman" w:hAnsi="Times New Roman"/>
+          <w:b/>
+          <w:sz w:val="28"/>
+          <w:szCs w:val="28"/>
+          <w:lang w:val="en-US"/>
+        </w:rPr>
+      </w:pPr>
+    </w:p>
+    <w:p>
+      <w:pPr>
+        <w:tabs>
+          <w:tab w:val="left" w:pos="2620"/>
+        </w:tabs>
+        <w:spacing w:after="0" w:line="240" w:lineRule="auto"/>
+        <w:ind w:left="360"/>
+        <w:jc w:val="center"/>
+        <w:rPr>
+          <w:rFonts w:ascii="Times New Roman" w:hAnsi="Times New Roman"/>
+          <w:b/>
+          <w:sz w:val="28"/>
+          <w:szCs w:val="28"/>
+        </w:rPr>
+      </w:pPr>
+      <w:bookmarkStart w:id="0" w:name="_GoBack"/>
+      <w:bookmarkEnd w:id="0"/>
+      <w:r>
+        <w:rPr>
+          <w:rFonts w:ascii="Times New Roman" w:hAnsi="Times New Roman"/>
+          <w:b/>
+          <w:sz w:val="28"/>
+          <w:szCs w:val="28"/>
+          <w:lang w:val="en-US"/>
+        </w:rPr>
         <w:t>III</w:t>
       </w:r>
       <w:r>
@@ -1153,6 +1336,17 @@
           <w:szCs w:val="28"/>
         </w:rPr>
       </w:pPr>
+    </w:p>
+    <w:p>
+      <w:pPr>
+        <w:spacing w:after="0" w:line="240" w:lineRule="auto"/>
+        <w:jc w:val="both"/>
+        <w:rPr>
+          <w:rFonts w:ascii="Times New Roman" w:hAnsi="Times New Roman"/>
+          <w:sz w:val="28"/>
+          <w:szCs w:val="28"/>
+        </w:rPr>
+      </w:pPr>
       <w:r>
         <w:rPr>
           <w:rFonts w:ascii="Times New Roman" w:hAnsi="Times New Roman"/>
@@ -1161,6 +1355,7 @@
         </w:rPr>
         <w:t>3.1 «</w:t>
       </w:r>
+      <w:proofErr w:type="gramStart"/>
       <w:r>
         <w:rPr>
           <w:rFonts w:ascii="Times New Roman" w:hAnsi="Times New Roman"/>
@@ -1176,7 +1371,16 @@
           <w:sz w:val="28"/>
           <w:szCs w:val="28"/>
         </w:rPr>
-        <w:t>»  имеет право:</w:t>
+        <w:t>»  имеет</w:t>
+      </w:r>
+      <w:proofErr w:type="gramEnd"/>
+      <w:r>
+        <w:rPr>
+          <w:rFonts w:ascii="Times New Roman" w:hAnsi="Times New Roman"/>
+          <w:sz w:val="28"/>
+          <w:szCs w:val="28"/>
+        </w:rPr>
+        <w:t xml:space="preserve"> право:</w:t>
       </w:r>
     </w:p>
     <w:p>
@@ -1212,7 +1416,25 @@
           <w:sz w:val="28"/>
           <w:szCs w:val="28"/>
         </w:rPr>
-        <w:t>» нарушившего обязательство по использованию книжки МДП (нарушение таможенных правил, утере книжки МДП или передаче её третьему лицу  и т.д.)</w:t>
+        <w:t xml:space="preserve">» нарушившего обязательство по использованию книжки МДП (нарушение таможенных правил, утере книжки МДП или передаче её третьему </w:t>
+      </w:r>
+      <w:proofErr w:type="gramStart"/>
+      <w:r>
+        <w:rPr>
+          <w:rFonts w:ascii="Times New Roman" w:hAnsi="Times New Roman"/>
+          <w:sz w:val="28"/>
+          <w:szCs w:val="28"/>
+        </w:rPr>
+        <w:t>лицу  и</w:t>
+      </w:r>
+      <w:proofErr w:type="gramEnd"/>
+      <w:r>
+        <w:rPr>
+          <w:rFonts w:ascii="Times New Roman" w:hAnsi="Times New Roman"/>
+          <w:sz w:val="28"/>
+          <w:szCs w:val="28"/>
+        </w:rPr>
+        <w:t xml:space="preserve"> т.д.)</w:t>
       </w:r>
     </w:p>
     <w:p>
@@ -1297,31 +1519,55 @@
           <w:sz w:val="28"/>
           <w:szCs w:val="28"/>
         </w:rPr>
-        <w:t>-Отказаться от перевозки груза(ов) если это угрожает жизни и здоровью людей, безопасности дорожного движения.</w:t>
-      </w:r>
-    </w:p>
-    <w:p>
-      <w:pPr>
-        <w:spacing w:after="0" w:line="240" w:lineRule="auto"/>
-        <w:jc w:val="both"/>
-        <w:rPr>
-          <w:rFonts w:ascii="Times New Roman" w:hAnsi="Times New Roman"/>
-          <w:sz w:val="28"/>
-          <w:szCs w:val="28"/>
-        </w:rPr>
-      </w:pPr>
-    </w:p>
-    <w:p>
-      <w:pPr>
-        <w:spacing w:after="0" w:line="240" w:lineRule="auto"/>
-        <w:jc w:val="center"/>
-        <w:rPr>
-          <w:rFonts w:ascii="Times New Roman" w:hAnsi="Times New Roman"/>
-          <w:b/>
-          <w:sz w:val="28"/>
-          <w:szCs w:val="28"/>
-        </w:rPr>
-      </w:pPr>
+        <w:t>-Отказаться от перевозки груза(</w:t>
+      </w:r>
+      <w:proofErr w:type="spellStart"/>
+      <w:r>
+        <w:rPr>
+          <w:rFonts w:ascii="Times New Roman" w:hAnsi="Times New Roman"/>
+          <w:sz w:val="28"/>
+          <w:szCs w:val="28"/>
+        </w:rPr>
+        <w:t>ов</w:t>
+      </w:r>
+      <w:proofErr w:type="spellEnd"/>
+      <w:r>
+        <w:rPr>
+          <w:rFonts w:ascii="Times New Roman" w:hAnsi="Times New Roman"/>
+          <w:sz w:val="28"/>
+          <w:szCs w:val="28"/>
+        </w:rPr>
+        <w:t>) если это угрожает жизни и здоровью людей, безопасности дорожного движения.</w:t>
+      </w:r>
+    </w:p>
+    <w:p>
+      <w:pPr>
+        <w:spacing w:after="0" w:line="240" w:lineRule="auto"/>
+        <w:rPr>
+          <w:rFonts w:ascii="Times New Roman" w:hAnsi="Times New Roman"/>
+          <w:sz w:val="28"/>
+          <w:szCs w:val="28"/>
+        </w:rPr>
+      </w:pPr>
+    </w:p>
+    <w:p>
+      <w:pPr>
+        <w:spacing w:after="0" w:line="240" w:lineRule="auto"/>
+        <w:rPr>
+          <w:rFonts w:ascii="Times New Roman" w:hAnsi="Times New Roman"/>
+          <w:b/>
+          <w:sz w:val="28"/>
+          <w:szCs w:val="28"/>
+        </w:rPr>
+      </w:pPr>
+      <w:r>
+        <w:rPr>
+          <w:rFonts w:ascii="Times New Roman" w:hAnsi="Times New Roman"/>
+          <w:sz w:val="28"/>
+          <w:szCs w:val="28"/>
+        </w:rPr>
+        <w:t xml:space="preserve">                             </w:t>
+      </w:r>
       <w:r>
         <w:rPr>
           <w:rFonts w:ascii="Times New Roman" w:hAnsi="Times New Roman"/>
@@ -1488,25 +1734,37 @@
     <w:p>
       <w:pPr>
         <w:spacing w:after="0" w:line="240" w:lineRule="auto"/>
-        <w:jc w:val="both"/>
-        <w:rPr>
-          <w:rFonts w:ascii="Times New Roman" w:hAnsi="Times New Roman"/>
-          <w:sz w:val="28"/>
-          <w:szCs w:val="28"/>
-        </w:rPr>
-      </w:pPr>
-    </w:p>
-    <w:p>
-      <w:pPr>
-        <w:spacing w:after="0" w:line="240" w:lineRule="auto"/>
-        <w:jc w:val="center"/>
-        <w:rPr>
-          <w:rFonts w:ascii="Times New Roman" w:hAnsi="Times New Roman"/>
-          <w:b/>
-          <w:sz w:val="28"/>
-          <w:szCs w:val="28"/>
-        </w:rPr>
-      </w:pPr>
+        <w:rPr>
+          <w:rFonts w:ascii="Times New Roman" w:hAnsi="Times New Roman"/>
+          <w:b/>
+          <w:sz w:val="28"/>
+          <w:szCs w:val="28"/>
+        </w:rPr>
+      </w:pPr>
+      <w:r>
+        <w:rPr>
+          <w:rFonts w:ascii="Times New Roman" w:hAnsi="Times New Roman"/>
+          <w:sz w:val="28"/>
+          <w:szCs w:val="28"/>
+        </w:rPr>
+        <w:t xml:space="preserve">                             </w:t>
+      </w:r>
+      <w:r>
+        <w:rPr>
+          <w:rFonts w:ascii="Times New Roman" w:hAnsi="Times New Roman"/>
+          <w:sz w:val="28"/>
+          <w:szCs w:val="28"/>
+        </w:rPr>
+        <w:t xml:space="preserve"> </w:t>
+      </w:r>
+      <w:r>
+        <w:rPr>
+          <w:rFonts w:ascii="Times New Roman" w:hAnsi="Times New Roman"/>
+          <w:sz w:val="28"/>
+          <w:szCs w:val="28"/>
+        </w:rPr>
+        <w:t xml:space="preserve">   </w:t>
+      </w:r>
       <w:r>
         <w:rPr>
           <w:rFonts w:ascii="Times New Roman" w:hAnsi="Times New Roman"/>
@@ -1524,7 +1782,27 @@
           <w:sz w:val="28"/>
           <w:szCs w:val="28"/>
         </w:rPr>
-        <w:t>. АДРЕСА  И ПОДПИСИ СТОРОН</w:t>
+        <w:t xml:space="preserve">. </w:t>
+      </w:r>
+      <w:proofErr w:type="gramStart"/>
+      <w:r>
+        <w:rPr>
+          <w:rFonts w:ascii="Times New Roman" w:hAnsi="Times New Roman"/>
+          <w:b/>
+          <w:sz w:val="28"/>
+          <w:szCs w:val="28"/>
+        </w:rPr>
+        <w:t>АДРЕСА  И</w:t>
+      </w:r>
+      <w:proofErr w:type="gramEnd"/>
+      <w:r>
+        <w:rPr>
+          <w:rFonts w:ascii="Times New Roman" w:hAnsi="Times New Roman"/>
+          <w:b/>
+          <w:sz w:val="28"/>
+          <w:szCs w:val="28"/>
+        </w:rPr>
+        <w:t xml:space="preserve"> ПОДПИСИ СТОРОН</w:t>
       </w:r>
     </w:p>
     <w:p>
@@ -1619,6 +1897,7 @@
         </w:rPr>
         <w:t xml:space="preserve"> </w:t>
       </w:r>
+      <w:proofErr w:type="gramStart"/>
       <w:r>
         <w:rPr>
           <w:rFonts w:ascii="Times New Roman" w:hAnsi="Times New Roman"/>
@@ -1643,8 +1922,9 @@
           <w:szCs w:val="24"/>
           <w:lang w:val="en-US"/>
         </w:rPr>
-        <w:t xml:space="preserve">       </w:t>
-      </w:r>
+        <w:t xml:space="preserve">   </w:t>
+      </w:r>
+      <w:proofErr w:type="gramEnd"/>
       <w:r>
         <w:rPr>
           <w:rFonts w:ascii="Times New Roman" w:hAnsi="Times New Roman"/>
@@ -1653,7 +1933,7 @@
           <w:szCs w:val="24"/>
           <w:lang w:val="en-US"/>
         </w:rPr>
-        <w:t xml:space="preserve">                   </w:t>
+        <w:t xml:space="preserve">    </w:t>
       </w:r>
       <w:r>
         <w:rPr>
@@ -1663,57 +1943,28 @@
           <w:szCs w:val="24"/>
           <w:lang w:val="en-US"/>
         </w:rPr>
+        <w:t xml:space="preserve">                   </w:t>
+      </w:r>
+      <w:r>
+        <w:rPr>
+          <w:rFonts w:ascii="Times New Roman" w:hAnsi="Times New Roman"/>
+          <w:b/>
+          <w:sz w:val="24"/>
+          <w:szCs w:val="24"/>
+          <w:lang w:val="en-US"/>
+        </w:rPr>
         <w:t xml:space="preserve"> </w:t>
       </w:r>
       <w:r>
         <w:rPr>
           <w:rFonts w:ascii="Times New Roman" w:hAnsi="Times New Roman"/>
           <w:b/>
+          <w:color w:val="FF0000"/>
           <w:sz w:val="24"/>
           <w:szCs w:val="28"/>
           <w:lang w:val="en-US"/>
         </w:rPr>
-        <w:t>KARIMOV</w:t>
-      </w:r>
-      <w:r>
-        <w:rPr>
-          <w:rFonts w:ascii="Times New Roman" w:hAnsi="Times New Roman"/>
-          <w:b/>
-          <w:sz w:val="24"/>
-          <w:szCs w:val="28"/>
-          <w:lang w:val="en-US"/>
-        </w:rPr>
-        <w:t xml:space="preserve"> </w:t>
-      </w:r>
-      <w:r>
-        <w:rPr>
-          <w:rFonts w:ascii="Times New Roman" w:hAnsi="Times New Roman"/>
-          <w:b/>
-          <w:sz w:val="24"/>
-          <w:szCs w:val="28"/>
-          <w:lang w:val="en-US"/>
-        </w:rPr>
-        <w:t>BEKZOD</w:t>
-      </w:r>
-      <w:r>
-        <w:rPr>
-          <w:rFonts w:ascii="Times New Roman" w:hAnsi="Times New Roman"/>
-          <w:b/>
-          <w:sz w:val="24"/>
-          <w:szCs w:val="28"/>
-          <w:lang w:val="en-US"/>
-        </w:rPr>
-        <w:t xml:space="preserve"> </w:t>
-      </w:r>
-      <w:r>
-        <w:rPr>
-          <w:rFonts w:ascii="Times New Roman" w:hAnsi="Times New Roman"/>
-          <w:b/>
-          <w:sz w:val="24"/>
-          <w:szCs w:val="28"/>
-          <w:lang w:val="en-US"/>
-        </w:rPr>
-        <w:t>MAMURJONOVICH</w:t>
+        <w:t>KARIMOV BEKZOD MAMURJONOVICH</w:t>
       </w:r>
     </w:p>
     <w:p>
@@ -1785,7 +2036,25 @@
           <w:sz w:val="20"/>
           <w:szCs w:val="20"/>
         </w:rPr>
-        <w:t xml:space="preserve">Ферганская область,                                                 </w:t>
+        <w:t xml:space="preserve">Ферганская </w:t>
+      </w:r>
+      <w:proofErr w:type="gramStart"/>
+      <w:r>
+        <w:rPr>
+          <w:rFonts w:ascii="Times New Roman" w:hAnsi="Times New Roman"/>
+          <w:sz w:val="20"/>
+          <w:szCs w:val="20"/>
+        </w:rPr>
+        <w:t xml:space="preserve">область,   </w:t>
+      </w:r>
+      <w:proofErr w:type="gramEnd"/>
+      <w:r>
+        <w:rPr>
+          <w:rFonts w:ascii="Times New Roman" w:hAnsi="Times New Roman"/>
+          <w:sz w:val="20"/>
+          <w:szCs w:val="20"/>
+        </w:rPr>
+        <w:t xml:space="preserve">                                              </w:t>
       </w:r>
       <w:r>
         <w:rPr>
@@ -1824,6 +2093,7 @@
         <w:rPr>
           <w:rFonts w:ascii="Arial" w:hAnsi="Arial" w:cs="Arial"/>
           <w:b/>
+          <w:color w:val="FF0000"/>
           <w:lang w:val="en-US"/>
         </w:rPr>
         <w:t>FA</w:t>
@@ -1832,6 +2102,7 @@
         <w:rPr>
           <w:rFonts w:ascii="Arial" w:hAnsi="Arial" w:cs="Arial"/>
           <w:b/>
+          <w:color w:val="FF0000"/>
         </w:rPr>
         <w:t xml:space="preserve"> </w:t>
       </w:r>
@@ -1839,6 +2110,7 @@
         <w:rPr>
           <w:rFonts w:ascii="Arial" w:hAnsi="Arial" w:cs="Arial"/>
           <w:b/>
+          <w:color w:val="FF0000"/>
           <w:lang w:val="uz-Latn-UZ"/>
         </w:rPr>
         <w:t>9316362</w:t>
@@ -1860,18 +2132,21 @@
           <w:lang w:val="uz-Cyrl-UZ"/>
         </w:rPr>
       </w:pPr>
+      <w:proofErr w:type="spellStart"/>
       <w:r>
         <w:rPr>
           <w:rFonts w:ascii="Times New Roman" w:hAnsi="Times New Roman"/>
         </w:rPr>
         <w:t>Дангаринский</w:t>
       </w:r>
+      <w:proofErr w:type="spellEnd"/>
       <w:r>
         <w:rPr>
           <w:rFonts w:ascii="Times New Roman" w:hAnsi="Times New Roman"/>
         </w:rPr>
         <w:t xml:space="preserve"> </w:t>
       </w:r>
+      <w:proofErr w:type="gramStart"/>
       <w:r>
         <w:rPr>
           <w:rFonts w:ascii="Times New Roman" w:hAnsi="Times New Roman"/>
@@ -1882,7 +2157,22 @@
         <w:rPr>
           <w:rFonts w:ascii="Times New Roman" w:hAnsi="Times New Roman"/>
         </w:rPr>
-        <w:t xml:space="preserve">  Саноат № 2                                                </w:t>
+        <w:t xml:space="preserve">  </w:t>
+      </w:r>
+      <w:proofErr w:type="spellStart"/>
+      <w:r>
+        <w:rPr>
+          <w:rFonts w:ascii="Times New Roman" w:hAnsi="Times New Roman"/>
+        </w:rPr>
+        <w:t>Саноат</w:t>
+      </w:r>
+      <w:proofErr w:type="spellEnd"/>
+      <w:proofErr w:type="gramEnd"/>
+      <w:r>
+        <w:rPr>
+          <w:rFonts w:ascii="Times New Roman" w:hAnsi="Times New Roman"/>
+        </w:rPr>
+        <w:t xml:space="preserve"> № 2                                                </w:t>
       </w:r>
       <w:r>
         <w:rPr>
@@ -1890,15 +2180,19 @@
         </w:rPr>
         <w:t xml:space="preserve"> </w:t>
       </w:r>
-      <w:r>
-        <w:rPr>
-          <w:rFonts w:ascii="Times New Roman" w:hAnsi="Times New Roman"/>
+      <w:proofErr w:type="spellStart"/>
+      <w:r>
+        <w:rPr>
+          <w:rFonts w:ascii="Times New Roman" w:hAnsi="Times New Roman"/>
+          <w:color w:val="FF0000"/>
         </w:rPr>
         <w:t>Ферган</w:t>
       </w:r>
-      <w:r>
-        <w:rPr>
-          <w:rFonts w:ascii="Times New Roman" w:hAnsi="Times New Roman"/>
+      <w:proofErr w:type="spellEnd"/>
+      <w:r>
+        <w:rPr>
+          <w:rFonts w:ascii="Times New Roman" w:hAnsi="Times New Roman"/>
+          <w:color w:val="FF0000"/>
           <w:lang w:val="uz-Cyrl-UZ"/>
         </w:rPr>
         <w:t>ская</w:t>
@@ -1906,6 +2200,7 @@
       <w:r>
         <w:rPr>
           <w:rFonts w:ascii="Times New Roman" w:hAnsi="Times New Roman"/>
+          <w:color w:val="FF0000"/>
           <w:lang w:val="uz-Cyrl-UZ"/>
         </w:rPr>
         <w:t xml:space="preserve"> область</w:t>
@@ -1945,6 +2240,7 @@
         <w:rPr>
           <w:rFonts w:ascii="Arial" w:hAnsi="Arial" w:cs="Arial"/>
           <w:b/>
+          <w:color w:val="FF0000"/>
           <w:lang w:val="uz-Latn-UZ"/>
         </w:rPr>
         <w:t>15.03.2024</w:t>
@@ -1953,6 +2249,7 @@
         <w:rPr>
           <w:rFonts w:ascii="Arial" w:hAnsi="Arial" w:cs="Arial"/>
           <w:b/>
+          <w:color w:val="FF0000"/>
         </w:rPr>
         <w:t>г</w:t>
       </w:r>
@@ -2133,122 +2430,107 @@
         <w:jc w:val="both"/>
         <w:rPr>
           <w:rFonts w:ascii="Times New Roman" w:hAnsi="Times New Roman"/>
-        </w:rPr>
-      </w:pPr>
-      <w:r>
-        <w:rPr>
-          <w:rFonts w:ascii="Times New Roman" w:hAnsi="Times New Roman"/>
-          <w:b/>
-        </w:rPr>
-        <w:t>Ген. Директор :   ___________________________Б. Мамажонов.</w:t>
-      </w:r>
-    </w:p>
-    <w:p>
-      <w:pPr>
-        <w:spacing w:after="0" w:line="240" w:lineRule="auto"/>
-        <w:jc w:val="both"/>
-        <w:rPr>
-          <w:rFonts w:ascii="Times New Roman" w:hAnsi="Times New Roman"/>
-        </w:rPr>
-      </w:pPr>
-    </w:p>
-    <w:p>
-      <w:pPr>
-        <w:spacing w:after="0" w:line="240" w:lineRule="auto"/>
-        <w:jc w:val="both"/>
-        <w:rPr>
-          <w:rFonts w:ascii="Times New Roman" w:hAnsi="Times New Roman"/>
-        </w:rPr>
-      </w:pPr>
-    </w:p>
-    <w:p>
-      <w:pPr>
-        <w:spacing w:after="0" w:line="240" w:lineRule="auto"/>
-        <w:jc w:val="center"/>
-        <w:rPr>
-          <w:rFonts w:ascii="Times New Roman" w:hAnsi="Times New Roman"/>
-          <w:b/>
-          <w:sz w:val="28"/>
-          <w:szCs w:val="28"/>
-        </w:rPr>
-      </w:pPr>
-    </w:p>
-    <w:p>
-      <w:pPr>
-        <w:spacing w:after="0" w:line="240" w:lineRule="auto"/>
-        <w:jc w:val="center"/>
-        <w:rPr>
-          <w:rFonts w:ascii="Times New Roman" w:hAnsi="Times New Roman"/>
-          <w:sz w:val="28"/>
-          <w:szCs w:val="28"/>
-        </w:rPr>
-      </w:pPr>
-    </w:p>
-    <w:p>
-      <w:pPr>
-        <w:spacing w:after="0" w:line="240" w:lineRule="auto"/>
-        <w:jc w:val="center"/>
-        <w:rPr>
-          <w:rFonts w:ascii="Times New Roman" w:hAnsi="Times New Roman"/>
-          <w:sz w:val="28"/>
-          <w:szCs w:val="28"/>
-        </w:rPr>
-      </w:pPr>
-    </w:p>
-    <w:p>
-      <w:pPr>
-        <w:spacing w:after="0" w:line="240" w:lineRule="auto"/>
-        <w:jc w:val="center"/>
-        <w:rPr>
-          <w:rFonts w:ascii="Times New Roman" w:hAnsi="Times New Roman"/>
-          <w:sz w:val="28"/>
-          <w:szCs w:val="28"/>
-        </w:rPr>
-      </w:pPr>
-    </w:p>
-    <w:p>
-      <w:pPr>
-        <w:spacing w:after="0" w:line="240" w:lineRule="auto"/>
-        <w:jc w:val="center"/>
-        <w:rPr>
-          <w:rFonts w:ascii="Times New Roman" w:hAnsi="Times New Roman"/>
-          <w:sz w:val="28"/>
-          <w:szCs w:val="28"/>
-        </w:rPr>
-      </w:pPr>
-      <w:bookmarkStart w:id="0" w:name="_GoBack"/>
-      <w:bookmarkEnd w:id="0"/>
-    </w:p>
-    <w:p>
-      <w:pPr>
-        <w:tabs>
-          <w:tab w:val="left" w:pos="2620"/>
-        </w:tabs>
-        <w:spacing w:after="0" w:line="240" w:lineRule="auto"/>
-        <w:ind w:left="360"/>
-        <w:jc w:val="both"/>
-        <w:rPr>
-          <w:rFonts w:ascii="Times New Roman" w:hAnsi="Times New Roman"/>
-          <w:b/>
-          <w:sz w:val="28"/>
-          <w:szCs w:val="28"/>
-        </w:rPr>
-      </w:pPr>
-    </w:p>
-    <w:p>
-      <w:pPr>
-        <w:tabs>
-          <w:tab w:val="left" w:pos="2620"/>
-        </w:tabs>
-        <w:spacing w:after="0" w:line="240" w:lineRule="auto"/>
-        <w:ind w:left="360"/>
-        <w:jc w:val="center"/>
-        <w:rPr>
-          <w:rFonts w:ascii="Times New Roman" w:hAnsi="Times New Roman"/>
-          <w:b/>
-          <w:sz w:val="28"/>
-          <w:szCs w:val="28"/>
-        </w:rPr>
+          <w:b/>
+        </w:rPr>
+      </w:pPr>
+    </w:p>
+    <w:p>
+      <w:pPr>
+        <w:spacing w:after="0" w:line="240" w:lineRule="auto"/>
+        <w:jc w:val="both"/>
+        <w:rPr>
+          <w:rFonts w:ascii="Times New Roman" w:hAnsi="Times New Roman"/>
+          <w:b/>
+        </w:rPr>
+      </w:pPr>
+    </w:p>
+    <w:p>
+      <w:pPr>
+        <w:spacing w:after="0" w:line="240" w:lineRule="auto"/>
+        <w:jc w:val="both"/>
+        <w:rPr>
+          <w:rFonts w:ascii="Times New Roman" w:hAnsi="Times New Roman"/>
+          <w:b/>
+        </w:rPr>
+      </w:pPr>
+    </w:p>
+    <w:p>
+      <w:pPr>
+        <w:spacing w:after="0" w:line="240" w:lineRule="auto"/>
+        <w:jc w:val="both"/>
+        <w:rPr>
+          <w:rFonts w:ascii="Times New Roman" w:hAnsi="Times New Roman"/>
+          <w:b/>
+        </w:rPr>
+      </w:pPr>
+    </w:p>
+    <w:p>
+      <w:pPr>
+        <w:spacing w:after="0" w:line="240" w:lineRule="auto"/>
+        <w:jc w:val="both"/>
+        <w:rPr>
+          <w:rFonts w:ascii="Times New Roman" w:hAnsi="Times New Roman"/>
+          <w:b/>
+        </w:rPr>
+      </w:pPr>
+    </w:p>
+    <w:p>
+      <w:pPr>
+        <w:spacing w:after="0" w:line="240" w:lineRule="auto"/>
+        <w:jc w:val="both"/>
+        <w:rPr>
+          <w:rFonts w:ascii="Times New Roman" w:hAnsi="Times New Roman"/>
+        </w:rPr>
+      </w:pPr>
+      <w:r>
+        <w:rPr>
+          <w:rFonts w:ascii="Times New Roman" w:hAnsi="Times New Roman"/>
+          <w:b/>
+        </w:rPr>
+        <w:t xml:space="preserve">  </w:t>
+      </w:r>
+      <w:r>
+        <w:rPr>
+          <w:rFonts w:ascii="Times New Roman" w:hAnsi="Times New Roman"/>
+          <w:b/>
+        </w:rPr>
+        <w:t xml:space="preserve">Ген. </w:t>
+      </w:r>
+      <w:proofErr w:type="gramStart"/>
+      <w:r>
+        <w:rPr>
+          <w:rFonts w:ascii="Times New Roman" w:hAnsi="Times New Roman"/>
+          <w:b/>
+        </w:rPr>
+        <w:t>Директор :</w:t>
+      </w:r>
+      <w:proofErr w:type="gramEnd"/>
+      <w:r>
+        <w:rPr>
+          <w:rFonts w:ascii="Times New Roman" w:hAnsi="Times New Roman"/>
+          <w:b/>
+        </w:rPr>
+        <w:t xml:space="preserve">   ___________________________Б. </w:t>
+      </w:r>
+      <w:proofErr w:type="spellStart"/>
+      <w:r>
+        <w:rPr>
+          <w:rFonts w:ascii="Times New Roman" w:hAnsi="Times New Roman"/>
+          <w:b/>
+        </w:rPr>
+        <w:t>Мамажонов</w:t>
+      </w:r>
+      <w:proofErr w:type="spellEnd"/>
+      <w:r>
+        <w:rPr>
+          <w:rFonts w:ascii="Times New Roman" w:hAnsi="Times New Roman"/>
+          <w:b/>
+        </w:rPr>
+        <w:t>.</w:t>
+      </w:r>
+    </w:p>
+    <w:p>
+      <w:pPr>
         <w:sectPr>
           <w:pgSz w:w="11906" w:h="16838"/>
           <w:pgMar w:top="1134" w:right="851" w:bottom="1134" w:left="1134" w:header="709" w:footer="709" w:gutter="0"/>
@@ -2272,14 +2554,14 @@
           <w:szCs w:val="28"/>
         </w:rPr>
       </w:pPr>
-      <w:r>
-        <w:rPr>
-          <w:rFonts w:ascii="Times New Roman" w:hAnsi="Times New Roman"/>
-          <w:b/>
-          <w:sz w:val="28"/>
-          <w:szCs w:val="28"/>
-        </w:rPr>
-        <w:lastRenderedPageBreak/>
+      <w:proofErr w:type="gramStart"/>
+      <w:r>
+        <w:rPr>
+          <w:rFonts w:ascii="Times New Roman" w:hAnsi="Times New Roman"/>
+          <w:b/>
+          <w:sz w:val="28"/>
+          <w:szCs w:val="28"/>
+        </w:rPr>
         <w:t xml:space="preserve">ДОГОВОР </w:t>
       </w:r>
       <w:r>
@@ -2300,22 +2582,35 @@
         </w:rPr>
         <w:t>№</w:t>
       </w:r>
-      <w:r>
-        <w:rPr>
-          <w:rFonts w:ascii="Times New Roman" w:hAnsi="Times New Roman"/>
-          <w:b/>
-          <w:sz w:val="28"/>
-          <w:szCs w:val="28"/>
-        </w:rPr>
-        <w:t>09</w:t>
-      </w:r>
-      <w:r>
-        <w:rPr>
-          <w:rFonts w:ascii="Times New Roman" w:hAnsi="Times New Roman"/>
-          <w:b/>
-          <w:sz w:val="28"/>
-          <w:szCs w:val="28"/>
-          <w:lang w:val="en-US"/>
+      <w:proofErr w:type="gramEnd"/>
+      <w:r>
+        <w:rPr>
+          <w:rFonts w:ascii="Times New Roman" w:hAnsi="Times New Roman"/>
+          <w:b/>
+          <w:color w:val="FF0000"/>
+          <w:sz w:val="28"/>
+          <w:szCs w:val="28"/>
+        </w:rPr>
+        <w:t xml:space="preserve">09 </w:t>
+      </w:r>
+      <w:r>
+        <w:rPr>
+          <w:rFonts w:ascii="Times New Roman" w:hAnsi="Times New Roman"/>
+          <w:b/>
+          <w:color w:val="FF0000"/>
+          <w:sz w:val="28"/>
+          <w:szCs w:val="28"/>
+        </w:rPr>
+        <w:t>/</w:t>
+      </w:r>
+      <w:r>
+        <w:rPr>
+          <w:rFonts w:ascii="Times New Roman" w:hAnsi="Times New Roman"/>
+          <w:b/>
+          <w:color w:val="FF0000"/>
+          <w:sz w:val="28"/>
+          <w:szCs w:val="28"/>
+          <w:lang w:val="uz-Cyrl-UZ"/>
         </w:rPr>
         <w:t xml:space="preserve"> </w:t>
       </w:r>
@@ -2323,35 +2618,18 @@
         <w:rPr>
           <w:rFonts w:ascii="Times New Roman" w:hAnsi="Times New Roman"/>
           <w:b/>
-          <w:sz w:val="28"/>
-          <w:szCs w:val="28"/>
-        </w:rPr>
-        <w:t>/</w:t>
-      </w:r>
-      <w:r>
-        <w:rPr>
-          <w:rFonts w:ascii="Times New Roman" w:hAnsi="Times New Roman"/>
-          <w:b/>
+          <w:color w:val="FF0000"/>
           <w:sz w:val="28"/>
           <w:szCs w:val="28"/>
           <w:lang w:val="uz-Cyrl-UZ"/>
         </w:rPr>
-        <w:t xml:space="preserve"> </w:t>
-      </w:r>
-      <w:r>
-        <w:rPr>
-          <w:rFonts w:ascii="Times New Roman" w:hAnsi="Times New Roman"/>
-          <w:b/>
-          <w:sz w:val="28"/>
-          <w:szCs w:val="28"/>
-          <w:lang w:val="uz-Cyrl-UZ"/>
-        </w:rPr>
         <w:t>202</w:t>
       </w:r>
       <w:r>
         <w:rPr>
           <w:rFonts w:ascii="Times New Roman" w:hAnsi="Times New Roman"/>
           <w:b/>
+          <w:color w:val="FF0000"/>
           <w:sz w:val="28"/>
           <w:szCs w:val="28"/>
         </w:rPr>
@@ -2565,8 +2843,18 @@
           <w:sz w:val="28"/>
           <w:szCs w:val="28"/>
         </w:rPr>
-        <w:t>Б, Мамажонов</w:t>
-      </w:r>
+        <w:t xml:space="preserve">Б, </w:t>
+      </w:r>
+      <w:proofErr w:type="spellStart"/>
+      <w:r>
+        <w:rPr>
+          <w:rFonts w:ascii="Times New Roman" w:hAnsi="Times New Roman"/>
+          <w:sz w:val="28"/>
+          <w:szCs w:val="28"/>
+        </w:rPr>
+        <w:t>Мамажонов</w:t>
+      </w:r>
+      <w:proofErr w:type="spellEnd"/>
       <w:r>
         <w:rPr>
           <w:rFonts w:ascii="Times New Roman" w:hAnsi="Times New Roman"/>
@@ -2595,6 +2883,7 @@
         <w:rPr>
           <w:rFonts w:ascii="Times New Roman" w:hAnsi="Times New Roman"/>
           <w:b/>
+          <w:color w:val="FF0000"/>
           <w:sz w:val="24"/>
           <w:szCs w:val="28"/>
           <w:lang w:val="en-US"/>
@@ -2605,6 +2894,7 @@
         <w:rPr>
           <w:rFonts w:ascii="Times New Roman" w:hAnsi="Times New Roman"/>
           <w:b/>
+          <w:color w:val="FF0000"/>
           <w:sz w:val="24"/>
           <w:szCs w:val="28"/>
         </w:rPr>
@@ -2614,6 +2904,7 @@
         <w:rPr>
           <w:rFonts w:ascii="Times New Roman" w:hAnsi="Times New Roman"/>
           <w:b/>
+          <w:color w:val="FF0000"/>
           <w:sz w:val="24"/>
           <w:szCs w:val="28"/>
           <w:lang w:val="en-US"/>
@@ -2624,6 +2915,7 @@
         <w:rPr>
           <w:rFonts w:ascii="Times New Roman" w:hAnsi="Times New Roman"/>
           <w:b/>
+          <w:color w:val="FF0000"/>
           <w:sz w:val="24"/>
           <w:szCs w:val="28"/>
         </w:rPr>
@@ -2633,6 +2925,7 @@
         <w:rPr>
           <w:rFonts w:ascii="Times New Roman" w:hAnsi="Times New Roman"/>
           <w:b/>
+          <w:color w:val="FF0000"/>
           <w:sz w:val="24"/>
           <w:szCs w:val="28"/>
           <w:lang w:val="en-US"/>
@@ -2782,7 +3075,25 @@
           <w:sz w:val="28"/>
           <w:szCs w:val="28"/>
         </w:rPr>
-        <w:t>Настоящий договор определяет удовлетворения спроса юридических и физических лиц в автомобильном транспорте. Обеспечение юридических и частных  владельцев автотранспортных средств равными условиями труда и осуществление их на рынке автотранспортных услуг.</w:t>
+        <w:t xml:space="preserve">Настоящий договор определяет удовлетворения спроса юридических и физических лиц в автомобильном транспорте. Обеспечение юридических и </w:t>
+      </w:r>
+      <w:proofErr w:type="gramStart"/>
+      <w:r>
+        <w:rPr>
+          <w:rFonts w:ascii="Times New Roman" w:hAnsi="Times New Roman"/>
+          <w:sz w:val="28"/>
+          <w:szCs w:val="28"/>
+        </w:rPr>
+        <w:t>частных  владельцев</w:t>
+      </w:r>
+      <w:proofErr w:type="gramEnd"/>
+      <w:r>
+        <w:rPr>
+          <w:rFonts w:ascii="Times New Roman" w:hAnsi="Times New Roman"/>
+          <w:sz w:val="28"/>
+          <w:szCs w:val="28"/>
+        </w:rPr>
+        <w:t xml:space="preserve"> автотранспортных средств равными условиями труда и осуществление их на рынке автотранспортных услуг.</w:t>
       </w:r>
     </w:p>
     <w:p>
@@ -2808,6 +3119,7 @@
         </w:rPr>
         <w:t xml:space="preserve"> </w:t>
       </w:r>
+      <w:proofErr w:type="gramStart"/>
       <w:r>
         <w:rPr>
           <w:rFonts w:ascii="Times New Roman" w:hAnsi="Times New Roman"/>
@@ -2816,6 +3128,7 @@
         </w:rPr>
         <w:t>1.2  «</w:t>
       </w:r>
+      <w:proofErr w:type="gramEnd"/>
       <w:r>
         <w:rPr>
           <w:rFonts w:ascii="Times New Roman" w:hAnsi="Times New Roman"/>
@@ -2882,13 +3195,23 @@
           <w:szCs w:val="28"/>
         </w:rPr>
       </w:pPr>
-      <w:r>
-        <w:rPr>
-          <w:rFonts w:ascii="Times New Roman" w:hAnsi="Times New Roman"/>
-          <w:sz w:val="28"/>
-          <w:szCs w:val="28"/>
-        </w:rPr>
-        <w:t>1.3  Количество и характеристики книжек МДП согласовываются сторонами.</w:t>
+      <w:proofErr w:type="gramStart"/>
+      <w:r>
+        <w:rPr>
+          <w:rFonts w:ascii="Times New Roman" w:hAnsi="Times New Roman"/>
+          <w:sz w:val="28"/>
+          <w:szCs w:val="28"/>
+        </w:rPr>
+        <w:t>1.3  Количество</w:t>
+      </w:r>
+      <w:proofErr w:type="gramEnd"/>
+      <w:r>
+        <w:rPr>
+          <w:rFonts w:ascii="Times New Roman" w:hAnsi="Times New Roman"/>
+          <w:sz w:val="28"/>
+          <w:szCs w:val="28"/>
+        </w:rPr>
+        <w:t xml:space="preserve"> и характеристики книжек МДП согласовываются сторонами.</w:t>
       </w:r>
     </w:p>
     <w:p>
@@ -2954,7 +3277,25 @@
           <w:sz w:val="28"/>
           <w:szCs w:val="28"/>
         </w:rPr>
-        <w:t>2.1 Книжка МДП действительна в течении 60 дней со дня выдачи для предоставления таможню  место отправки.</w:t>
+        <w:t xml:space="preserve">2.1 Книжка МДП действительна в течении 60 дней со дня выдачи для предоставления </w:t>
+      </w:r>
+      <w:proofErr w:type="gramStart"/>
+      <w:r>
+        <w:rPr>
+          <w:rFonts w:ascii="Times New Roman" w:hAnsi="Times New Roman"/>
+          <w:sz w:val="28"/>
+          <w:szCs w:val="28"/>
+        </w:rPr>
+        <w:t>таможню  место</w:t>
+      </w:r>
+      <w:proofErr w:type="gramEnd"/>
+      <w:r>
+        <w:rPr>
+          <w:rFonts w:ascii="Times New Roman" w:hAnsi="Times New Roman"/>
+          <w:sz w:val="28"/>
+          <w:szCs w:val="28"/>
+        </w:rPr>
+        <w:t xml:space="preserve"> отправки.</w:t>
       </w:r>
     </w:p>
     <w:p>
@@ -2972,13 +3313,23 @@
           <w:szCs w:val="28"/>
         </w:rPr>
       </w:pPr>
-      <w:r>
-        <w:rPr>
-          <w:rFonts w:ascii="Times New Roman" w:hAnsi="Times New Roman"/>
-          <w:sz w:val="28"/>
-          <w:szCs w:val="28"/>
-        </w:rPr>
-        <w:t xml:space="preserve">2.2  Книжка МДП должна быть возвращена  </w:t>
+      <w:proofErr w:type="gramStart"/>
+      <w:r>
+        <w:rPr>
+          <w:rFonts w:ascii="Times New Roman" w:hAnsi="Times New Roman"/>
+          <w:sz w:val="28"/>
+          <w:szCs w:val="28"/>
+        </w:rPr>
+        <w:t>2.2  Книжка</w:t>
+      </w:r>
+      <w:proofErr w:type="gramEnd"/>
+      <w:r>
+        <w:rPr>
+          <w:rFonts w:ascii="Times New Roman" w:hAnsi="Times New Roman"/>
+          <w:sz w:val="28"/>
+          <w:szCs w:val="28"/>
+        </w:rPr>
+        <w:t xml:space="preserve"> МДП должна быть возвращена  </w:t>
       </w:r>
       <w:r>
         <w:rPr>
@@ -3189,6 +3540,7 @@
         </w:rPr>
         <w:t>«</w:t>
       </w:r>
+      <w:proofErr w:type="gramStart"/>
       <w:r>
         <w:rPr>
           <w:rFonts w:ascii="Times New Roman" w:hAnsi="Times New Roman"/>
@@ -3212,7 +3564,16 @@
           <w:sz w:val="28"/>
           <w:szCs w:val="28"/>
         </w:rPr>
-        <w:t xml:space="preserve">  производится по факту реализации книжек МДП (100% предоплата).</w:t>
+        <w:t xml:space="preserve">  производится</w:t>
+      </w:r>
+      <w:proofErr w:type="gramEnd"/>
+      <w:r>
+        <w:rPr>
+          <w:rFonts w:ascii="Times New Roman" w:hAnsi="Times New Roman"/>
+          <w:sz w:val="28"/>
+          <w:szCs w:val="28"/>
+        </w:rPr>
+        <w:t xml:space="preserve"> по факту реализации книжек МДП (100% предоплата).</w:t>
       </w:r>
     </w:p>
     <w:p>
@@ -3231,6 +3592,7 @@
           <w:szCs w:val="28"/>
         </w:rPr>
       </w:pPr>
+      <w:proofErr w:type="gramStart"/>
       <w:r>
         <w:rPr>
           <w:rFonts w:ascii="Times New Roman" w:hAnsi="Times New Roman"/>
@@ -3247,6 +3609,7 @@
         </w:rPr>
         <w:t>«</w:t>
       </w:r>
+      <w:proofErr w:type="gramEnd"/>
       <w:r>
         <w:rPr>
           <w:rFonts w:ascii="Times New Roman" w:hAnsi="Times New Roman"/>
@@ -3365,6 +3728,7 @@
           <w:u w:val="single"/>
         </w:rPr>
       </w:pPr>
+      <w:proofErr w:type="gramStart"/>
       <w:r>
         <w:rPr>
           <w:rFonts w:ascii="Times New Roman" w:hAnsi="Times New Roman"/>
@@ -3380,7 +3744,37 @@
           <w:szCs w:val="28"/>
           <w:u w:val="single"/>
         </w:rPr>
-        <w:t xml:space="preserve">  вступительный взнос                                             50000 сум;</w:t>
+        <w:t xml:space="preserve">  вступительный</w:t>
+      </w:r>
+      <w:proofErr w:type="gramEnd"/>
+      <w:r>
+        <w:rPr>
+          <w:rFonts w:ascii="Times New Roman" w:hAnsi="Times New Roman"/>
+          <w:sz w:val="28"/>
+          <w:szCs w:val="28"/>
+          <w:u w:val="single"/>
+        </w:rPr>
+        <w:t xml:space="preserve"> взнос                                             50000 </w:t>
+      </w:r>
+      <w:proofErr w:type="spellStart"/>
+      <w:r>
+        <w:rPr>
+          <w:rFonts w:ascii="Times New Roman" w:hAnsi="Times New Roman"/>
+          <w:sz w:val="28"/>
+          <w:szCs w:val="28"/>
+          <w:u w:val="single"/>
+        </w:rPr>
+        <w:t>сум</w:t>
+      </w:r>
+      <w:proofErr w:type="spellEnd"/>
+      <w:r>
+        <w:rPr>
+          <w:rFonts w:ascii="Times New Roman" w:hAnsi="Times New Roman"/>
+          <w:sz w:val="28"/>
+          <w:szCs w:val="28"/>
+          <w:u w:val="single"/>
+        </w:rPr>
+        <w:t>;</w:t>
       </w:r>
     </w:p>
     <w:p>
@@ -3400,6 +3794,7 @@
           <w:u w:val="single"/>
         </w:rPr>
       </w:pPr>
+      <w:proofErr w:type="gramStart"/>
       <w:r>
         <w:rPr>
           <w:rFonts w:ascii="Times New Roman" w:hAnsi="Times New Roman"/>
@@ -3415,7 +3810,17 @@
           <w:szCs w:val="28"/>
           <w:u w:val="single"/>
         </w:rPr>
-        <w:t xml:space="preserve">  ежегодный членский взнос, один раз в год             50000сум;</w:t>
+        <w:t xml:space="preserve">  ежегодный</w:t>
+      </w:r>
+      <w:proofErr w:type="gramEnd"/>
+      <w:r>
+        <w:rPr>
+          <w:rFonts w:ascii="Times New Roman" w:hAnsi="Times New Roman"/>
+          <w:sz w:val="28"/>
+          <w:szCs w:val="28"/>
+          <w:u w:val="single"/>
+        </w:rPr>
+        <w:t xml:space="preserve"> членский взнос, один раз в год             50000сум;</w:t>
       </w:r>
     </w:p>
     <w:p>
@@ -3435,6 +3840,7 @@
           <w:u w:val="single"/>
         </w:rPr>
       </w:pPr>
+      <w:proofErr w:type="gramStart"/>
       <w:r>
         <w:rPr>
           <w:rFonts w:ascii="Times New Roman" w:hAnsi="Times New Roman"/>
@@ -3450,7 +3856,17 @@
           <w:szCs w:val="28"/>
           <w:u w:val="single"/>
         </w:rPr>
-        <w:t xml:space="preserve">  расходы на содержание  </w:t>
+        <w:t xml:space="preserve">  расходы</w:t>
+      </w:r>
+      <w:proofErr w:type="gramEnd"/>
+      <w:r>
+        <w:rPr>
+          <w:rFonts w:ascii="Times New Roman" w:hAnsi="Times New Roman"/>
+          <w:sz w:val="28"/>
+          <w:szCs w:val="28"/>
+          <w:u w:val="single"/>
+        </w:rPr>
+        <w:t xml:space="preserve"> на содержание  </w:t>
       </w:r>
       <w:r>
         <w:rPr>
@@ -3507,6 +3923,7 @@
           <w:u w:val="single"/>
         </w:rPr>
       </w:pPr>
+      <w:proofErr w:type="gramStart"/>
       <w:r>
         <w:rPr>
           <w:rFonts w:ascii="Times New Roman" w:hAnsi="Times New Roman"/>
@@ -3522,7 +3939,17 @@
           <w:szCs w:val="28"/>
           <w:u w:val="single"/>
         </w:rPr>
-        <w:t xml:space="preserve">  стоимость книжек МДП-120</w:t>
+        <w:t xml:space="preserve">  стоимость</w:t>
+      </w:r>
+      <w:proofErr w:type="gramEnd"/>
+      <w:r>
+        <w:rPr>
+          <w:rFonts w:ascii="Times New Roman" w:hAnsi="Times New Roman"/>
+          <w:sz w:val="28"/>
+          <w:szCs w:val="28"/>
+          <w:u w:val="single"/>
+        </w:rPr>
+        <w:t xml:space="preserve"> книжек МДП-120</w:t>
       </w:r>
       <w:r>
         <w:rPr>
@@ -3919,7 +4346,25 @@
           <w:sz w:val="28"/>
           <w:szCs w:val="28"/>
         </w:rPr>
-        <w:t xml:space="preserve"> В случаи не исполнения или не надлежащего исполнения обязательств, предусмотренных настоящим договором стороны несут ответственность в соответствии с действующим законодательством Республики Узбекистан.</w:t>
+        <w:t xml:space="preserve"> В случаи </w:t>
+      </w:r>
+      <w:proofErr w:type="gramStart"/>
+      <w:r>
+        <w:rPr>
+          <w:rFonts w:ascii="Times New Roman" w:hAnsi="Times New Roman"/>
+          <w:sz w:val="28"/>
+          <w:szCs w:val="28"/>
+        </w:rPr>
+        <w:t>не исполнения</w:t>
+      </w:r>
+      <w:proofErr w:type="gramEnd"/>
+      <w:r>
+        <w:rPr>
+          <w:rFonts w:ascii="Times New Roman" w:hAnsi="Times New Roman"/>
+          <w:sz w:val="28"/>
+          <w:szCs w:val="28"/>
+        </w:rPr>
+        <w:t xml:space="preserve"> или не надлежащего исполнения обязательств, предусмотренных настоящим договором стороны несут ответственность в соответствии с действующим законодательством Республики Узбекистан.</w:t>
       </w:r>
     </w:p>
     <w:p>
@@ -4043,6 +4488,7 @@
         </w:rPr>
         <w:t>6.1 Настоящий договор вступает в силу с момента подписания и действует по</w:t>
       </w:r>
+      <w:proofErr w:type="gramStart"/>
       <w:r>
         <w:rPr>
           <w:rFonts w:ascii="Times New Roman" w:hAnsi="Times New Roman"/>
@@ -4071,15 +4517,18 @@
         <w:rPr>
           <w:rFonts w:ascii="Times New Roman" w:hAnsi="Times New Roman"/>
           <w:b/>
+          <w:color w:val="FF0000"/>
           <w:sz w:val="28"/>
           <w:szCs w:val="28"/>
         </w:rPr>
         <w:t>«</w:t>
       </w:r>
-      <w:r>
-        <w:rPr>
-          <w:rFonts w:ascii="Times New Roman" w:hAnsi="Times New Roman"/>
-          <w:b/>
+      <w:proofErr w:type="gramEnd"/>
+      <w:r>
+        <w:rPr>
+          <w:rFonts w:ascii="Times New Roman" w:hAnsi="Times New Roman"/>
+          <w:b/>
+          <w:color w:val="FF0000"/>
           <w:sz w:val="28"/>
           <w:szCs w:val="28"/>
         </w:rPr>
@@ -4089,6 +4538,7 @@
         <w:rPr>
           <w:rFonts w:ascii="Times New Roman" w:hAnsi="Times New Roman"/>
           <w:b/>
+          <w:color w:val="FF0000"/>
           <w:sz w:val="28"/>
           <w:szCs w:val="28"/>
         </w:rPr>
@@ -4098,6 +4548,7 @@
         <w:rPr>
           <w:rFonts w:ascii="Times New Roman" w:hAnsi="Times New Roman"/>
           <w:b/>
+          <w:color w:val="FF0000"/>
           <w:sz w:val="28"/>
           <w:szCs w:val="28"/>
         </w:rPr>
@@ -4107,6 +4558,7 @@
         <w:rPr>
           <w:rFonts w:ascii="Times New Roman" w:hAnsi="Times New Roman"/>
           <w:b/>
+          <w:color w:val="FF0000"/>
           <w:sz w:val="28"/>
           <w:szCs w:val="28"/>
         </w:rPr>
@@ -4116,6 +4568,7 @@
         <w:rPr>
           <w:rFonts w:ascii="Times New Roman" w:hAnsi="Times New Roman"/>
           <w:b/>
+          <w:color w:val="FF0000"/>
           <w:sz w:val="28"/>
           <w:szCs w:val="28"/>
         </w:rPr>
@@ -4125,6 +4578,7 @@
         <w:rPr>
           <w:rFonts w:ascii="Times New Roman" w:hAnsi="Times New Roman"/>
           <w:b/>
+          <w:color w:val="FF0000"/>
           <w:sz w:val="28"/>
           <w:szCs w:val="28"/>
         </w:rPr>
@@ -4134,6 +4588,7 @@
         <w:rPr>
           <w:rFonts w:ascii="Times New Roman" w:hAnsi="Times New Roman"/>
           <w:b/>
+          <w:color w:val="FF0000"/>
           <w:sz w:val="28"/>
           <w:szCs w:val="28"/>
         </w:rPr>
@@ -4143,6 +4598,7 @@
         <w:rPr>
           <w:rFonts w:ascii="Times New Roman" w:hAnsi="Times New Roman"/>
           <w:b/>
+          <w:color w:val="FF0000"/>
           <w:sz w:val="28"/>
           <w:szCs w:val="28"/>
         </w:rPr>
@@ -4173,12 +4629,23 @@
           <w:sz w:val="28"/>
           <w:szCs w:val="28"/>
         </w:rPr>
-        <w:t xml:space="preserve">  «</w:t>
-      </w:r>
-      <w:r>
-        <w:rPr>
-          <w:rFonts w:ascii="Times New Roman" w:hAnsi="Times New Roman"/>
-          <w:b/>
+        <w:t xml:space="preserve">  </w:t>
+      </w:r>
+      <w:r>
+        <w:rPr>
+          <w:rFonts w:ascii="Times New Roman" w:hAnsi="Times New Roman"/>
+          <w:b/>
+          <w:color w:val="FF0000"/>
+          <w:sz w:val="28"/>
+          <w:szCs w:val="28"/>
+        </w:rPr>
+        <w:t>«</w:t>
+      </w:r>
+      <w:r>
+        <w:rPr>
+          <w:rFonts w:ascii="Times New Roman" w:hAnsi="Times New Roman"/>
+          <w:b/>
+          <w:color w:val="FF0000"/>
           <w:sz w:val="28"/>
           <w:szCs w:val="28"/>
         </w:rPr>
@@ -4188,6 +4655,7 @@
         <w:rPr>
           <w:rFonts w:ascii="Times New Roman" w:hAnsi="Times New Roman"/>
           <w:b/>
+          <w:color w:val="FF0000"/>
           <w:sz w:val="28"/>
           <w:szCs w:val="28"/>
         </w:rPr>
@@ -4197,6 +4665,7 @@
         <w:rPr>
           <w:rFonts w:ascii="Times New Roman" w:hAnsi="Times New Roman"/>
           <w:b/>
+          <w:color w:val="FF0000"/>
           <w:sz w:val="28"/>
           <w:szCs w:val="28"/>
         </w:rPr>
@@ -4206,6 +4675,7 @@
         <w:rPr>
           <w:rFonts w:ascii="Times New Roman" w:hAnsi="Times New Roman"/>
           <w:b/>
+          <w:color w:val="FF0000"/>
           <w:sz w:val="28"/>
           <w:szCs w:val="28"/>
         </w:rPr>
@@ -4215,6 +4685,7 @@
         <w:rPr>
           <w:rFonts w:ascii="Times New Roman" w:hAnsi="Times New Roman"/>
           <w:b/>
+          <w:color w:val="FF0000"/>
           <w:sz w:val="28"/>
           <w:szCs w:val="28"/>
         </w:rPr>
@@ -4224,6 +4695,7 @@
         <w:rPr>
           <w:rFonts w:ascii="Times New Roman" w:hAnsi="Times New Roman"/>
           <w:b/>
+          <w:color w:val="FF0000"/>
           <w:sz w:val="28"/>
           <w:szCs w:val="28"/>
         </w:rPr>
@@ -4329,7 +4801,25 @@
           <w:sz w:val="28"/>
           <w:szCs w:val="28"/>
         </w:rPr>
-        <w:t>» выполнять Диклорацию-обязательство, подписанный за №</w:t>
+        <w:t xml:space="preserve">» выполнять </w:t>
+      </w:r>
+      <w:proofErr w:type="spellStart"/>
+      <w:r>
+        <w:rPr>
+          <w:rFonts w:ascii="Times New Roman" w:hAnsi="Times New Roman"/>
+          <w:sz w:val="28"/>
+          <w:szCs w:val="28"/>
+        </w:rPr>
+        <w:t>Диклорацию</w:t>
+      </w:r>
+      <w:proofErr w:type="spellEnd"/>
+      <w:r>
+        <w:rPr>
+          <w:rFonts w:ascii="Times New Roman" w:hAnsi="Times New Roman"/>
+          <w:sz w:val="28"/>
+          <w:szCs w:val="28"/>
+        </w:rPr>
+        <w:t>-обязательство, подписанный за №</w:t>
       </w:r>
       <w:r>
         <w:rPr>
@@ -4355,6 +4845,7 @@
         </w:rPr>
         <w:t xml:space="preserve"> </w:t>
       </w:r>
+      <w:proofErr w:type="gramStart"/>
       <w:r>
         <w:rPr>
           <w:rFonts w:ascii="Times New Roman" w:hAnsi="Times New Roman"/>
@@ -4363,6 +4854,7 @@
         </w:rPr>
         <w:t>от  «</w:t>
       </w:r>
+      <w:proofErr w:type="gramEnd"/>
       <w:r>
         <w:rPr>
           <w:rFonts w:ascii="Times New Roman" w:hAnsi="Times New Roman"/>
@@ -4459,7 +4951,25 @@
           <w:sz w:val="28"/>
           <w:szCs w:val="28"/>
         </w:rPr>
-        <w:t>» согласно подписанной Диклорации-Обязательства.</w:t>
+        <w:t xml:space="preserve">» согласно подписанной </w:t>
+      </w:r>
+      <w:proofErr w:type="spellStart"/>
+      <w:r>
+        <w:rPr>
+          <w:rFonts w:ascii="Times New Roman" w:hAnsi="Times New Roman"/>
+          <w:sz w:val="28"/>
+          <w:szCs w:val="28"/>
+        </w:rPr>
+        <w:t>Диклорации</w:t>
+      </w:r>
+      <w:proofErr w:type="spellEnd"/>
+      <w:r>
+        <w:rPr>
+          <w:rFonts w:ascii="Times New Roman" w:hAnsi="Times New Roman"/>
+          <w:sz w:val="28"/>
+          <w:szCs w:val="28"/>
+        </w:rPr>
+        <w:t>-Обязательства.</w:t>
       </w:r>
     </w:p>
     <w:p>
@@ -4484,7 +4994,25 @@
           <w:sz w:val="28"/>
           <w:szCs w:val="28"/>
         </w:rPr>
-        <w:t>7.2 В случаи отказа исполнения подписанной Диклорации-Обязательства, договор расторгается.</w:t>
+        <w:t xml:space="preserve">7.2 В случаи отказа исполнения подписанной </w:t>
+      </w:r>
+      <w:proofErr w:type="spellStart"/>
+      <w:r>
+        <w:rPr>
+          <w:rFonts w:ascii="Times New Roman" w:hAnsi="Times New Roman"/>
+          <w:sz w:val="28"/>
+          <w:szCs w:val="28"/>
+        </w:rPr>
+        <w:t>Диклорации</w:t>
+      </w:r>
+      <w:proofErr w:type="spellEnd"/>
+      <w:r>
+        <w:rPr>
+          <w:rFonts w:ascii="Times New Roman" w:hAnsi="Times New Roman"/>
+          <w:sz w:val="28"/>
+          <w:szCs w:val="28"/>
+        </w:rPr>
+        <w:t>-Обязательства, договор расторгается.</w:t>
       </w:r>
     </w:p>
     <w:p>
@@ -4639,6 +5167,7 @@
           <w:szCs w:val="20"/>
         </w:rPr>
       </w:pPr>
+      <w:proofErr w:type="gramStart"/>
       <w:r>
         <w:rPr>
           <w:rFonts w:ascii="Times New Roman" w:hAnsi="Times New Roman"/>
@@ -4653,13 +5182,44 @@
         </w:rPr>
         <w:t>«</w:t>
       </w:r>
+      <w:proofErr w:type="gramEnd"/>
       <w:r>
         <w:rPr>
           <w:rFonts w:ascii="Times New Roman" w:hAnsi="Times New Roman"/>
           <w:b/>
           <w:lang w:val="en-US"/>
         </w:rPr>
-        <w:t>MUSFIRASAVDOTRANS</w:t>
+        <w:t>MUSFIRA</w:t>
+      </w:r>
+      <w:r>
+        <w:rPr>
+          <w:rFonts w:ascii="Times New Roman" w:hAnsi="Times New Roman"/>
+          <w:b/>
+        </w:rPr>
+        <w:t xml:space="preserve"> </w:t>
+      </w:r>
+      <w:r>
+        <w:rPr>
+          <w:rFonts w:ascii="Times New Roman" w:hAnsi="Times New Roman"/>
+          <w:b/>
+          <w:lang w:val="en-US"/>
+        </w:rPr>
+        <w:t>SAVDO</w:t>
+      </w:r>
+      <w:r>
+        <w:rPr>
+          <w:rFonts w:ascii="Times New Roman" w:hAnsi="Times New Roman"/>
+          <w:b/>
+        </w:rPr>
+        <w:t xml:space="preserve"> </w:t>
+      </w:r>
+      <w:r>
+        <w:rPr>
+          <w:rFonts w:ascii="Times New Roman" w:hAnsi="Times New Roman"/>
+          <w:b/>
+          <w:lang w:val="en-US"/>
+        </w:rPr>
+        <w:t>TRANS</w:t>
       </w:r>
       <w:r>
         <w:rPr>
@@ -4720,6 +5280,7 @@
         <w:rPr>
           <w:rFonts w:ascii="Times New Roman" w:hAnsi="Times New Roman"/>
           <w:b/>
+          <w:color w:val="FF0000"/>
           <w:sz w:val="24"/>
           <w:szCs w:val="28"/>
           <w:lang w:val="en-US"/>
@@ -4730,6 +5291,7 @@
         <w:rPr>
           <w:rFonts w:ascii="Times New Roman" w:hAnsi="Times New Roman"/>
           <w:b/>
+          <w:color w:val="FF0000"/>
           <w:sz w:val="24"/>
           <w:szCs w:val="28"/>
         </w:rPr>
@@ -4739,6 +5301,7 @@
         <w:rPr>
           <w:rFonts w:ascii="Times New Roman" w:hAnsi="Times New Roman"/>
           <w:b/>
+          <w:color w:val="FF0000"/>
           <w:sz w:val="24"/>
           <w:szCs w:val="28"/>
           <w:lang w:val="en-US"/>
@@ -4749,6 +5312,7 @@
         <w:rPr>
           <w:rFonts w:ascii="Times New Roman" w:hAnsi="Times New Roman"/>
           <w:b/>
+          <w:color w:val="FF0000"/>
           <w:sz w:val="24"/>
           <w:szCs w:val="28"/>
         </w:rPr>
@@ -4758,6 +5322,7 @@
         <w:rPr>
           <w:rFonts w:ascii="Times New Roman" w:hAnsi="Times New Roman"/>
           <w:b/>
+          <w:color w:val="FF0000"/>
           <w:sz w:val="24"/>
           <w:szCs w:val="28"/>
           <w:lang w:val="en-US"/>
@@ -4858,23 +5423,25 @@
           <w:sz w:val="20"/>
           <w:szCs w:val="20"/>
         </w:rPr>
-        <w:t xml:space="preserve">Ферганская область,                                                 </w:t>
-      </w:r>
+        <w:t xml:space="preserve">Ферганская </w:t>
+      </w:r>
+      <w:proofErr w:type="gramStart"/>
       <w:r>
         <w:rPr>
           <w:rFonts w:ascii="Times New Roman" w:hAnsi="Times New Roman"/>
           <w:sz w:val="20"/>
           <w:szCs w:val="20"/>
         </w:rPr>
-        <w:t xml:space="preserve">             </w:t>
-      </w:r>
+        <w:t xml:space="preserve">область,   </w:t>
+      </w:r>
+      <w:proofErr w:type="gramEnd"/>
       <w:r>
         <w:rPr>
           <w:rFonts w:ascii="Times New Roman" w:hAnsi="Times New Roman"/>
           <w:sz w:val="20"/>
           <w:szCs w:val="20"/>
         </w:rPr>
-        <w:t xml:space="preserve"> </w:t>
+        <w:t xml:space="preserve">                                              </w:t>
       </w:r>
       <w:r>
         <w:rPr>
@@ -4882,7 +5449,7 @@
           <w:sz w:val="20"/>
           <w:szCs w:val="20"/>
         </w:rPr>
-        <w:t xml:space="preserve">         </w:t>
+        <w:t xml:space="preserve">             </w:t>
       </w:r>
       <w:r>
         <w:rPr>
@@ -4898,7 +5465,7 @@
           <w:sz w:val="20"/>
           <w:szCs w:val="20"/>
         </w:rPr>
-        <w:t xml:space="preserve"> </w:t>
+        <w:t xml:space="preserve">         </w:t>
       </w:r>
       <w:r>
         <w:rPr>
@@ -4911,6 +5478,22 @@
       <w:r>
         <w:rPr>
           <w:rFonts w:ascii="Times New Roman" w:hAnsi="Times New Roman"/>
+          <w:sz w:val="20"/>
+          <w:szCs w:val="20"/>
+        </w:rPr>
+        <w:t xml:space="preserve"> </w:t>
+      </w:r>
+      <w:r>
+        <w:rPr>
+          <w:rFonts w:ascii="Times New Roman" w:hAnsi="Times New Roman"/>
+          <w:sz w:val="20"/>
+          <w:szCs w:val="20"/>
+        </w:rPr>
+        <w:t xml:space="preserve"> </w:t>
+      </w:r>
+      <w:r>
+        <w:rPr>
+          <w:rFonts w:ascii="Times New Roman" w:hAnsi="Times New Roman"/>
           <w:b/>
         </w:rPr>
         <w:t>Паспорт</w:t>
@@ -4925,6 +5508,7 @@
         <w:rPr>
           <w:rFonts w:ascii="Arial" w:hAnsi="Arial" w:cs="Arial"/>
           <w:b/>
+          <w:color w:val="FF0000"/>
           <w:lang w:val="en-US"/>
         </w:rPr>
         <w:t>FA</w:t>
@@ -4933,6 +5517,7 @@
         <w:rPr>
           <w:rFonts w:ascii="Arial" w:hAnsi="Arial" w:cs="Arial"/>
           <w:b/>
+          <w:color w:val="FF0000"/>
         </w:rPr>
         <w:t xml:space="preserve"> </w:t>
       </w:r>
@@ -4940,6 +5525,7 @@
         <w:rPr>
           <w:rFonts w:ascii="Arial" w:hAnsi="Arial" w:cs="Arial"/>
           <w:b/>
+          <w:color w:val="FF0000"/>
           <w:lang w:val="uz-Latn-UZ"/>
         </w:rPr>
         <w:t>9316362</w:t>
@@ -4964,35 +5550,63 @@
           <w:lang w:val="uz-Cyrl-UZ"/>
         </w:rPr>
       </w:pPr>
+      <w:proofErr w:type="spellStart"/>
       <w:r>
         <w:rPr>
           <w:rFonts w:ascii="Times New Roman" w:hAnsi="Times New Roman"/>
         </w:rPr>
         <w:t>Дангаринский</w:t>
       </w:r>
-      <w:r>
-        <w:rPr>
-          <w:rFonts w:ascii="Times New Roman" w:hAnsi="Times New Roman"/>
-        </w:rPr>
-        <w:t xml:space="preserve"> район</w:t>
-      </w:r>
-      <w:r>
-        <w:rPr>
-          <w:rFonts w:ascii="Times New Roman" w:hAnsi="Times New Roman"/>
-        </w:rPr>
-        <w:t xml:space="preserve">  Саноат № 2                                          </w:t>
-      </w:r>
-      <w:r>
-        <w:rPr>
-          <w:rFonts w:ascii="Times New Roman" w:hAnsi="Times New Roman"/>
-          <w:b/>
+      <w:proofErr w:type="spellEnd"/>
+      <w:r>
+        <w:rPr>
+          <w:rFonts w:ascii="Times New Roman" w:hAnsi="Times New Roman"/>
+        </w:rPr>
+        <w:t xml:space="preserve"> </w:t>
+      </w:r>
+      <w:proofErr w:type="gramStart"/>
+      <w:r>
+        <w:rPr>
+          <w:rFonts w:ascii="Times New Roman" w:hAnsi="Times New Roman"/>
+        </w:rPr>
+        <w:t>район</w:t>
+      </w:r>
+      <w:r>
+        <w:rPr>
+          <w:rFonts w:ascii="Times New Roman" w:hAnsi="Times New Roman"/>
+        </w:rPr>
+        <w:t xml:space="preserve">  </w:t>
+      </w:r>
+      <w:proofErr w:type="spellStart"/>
+      <w:r>
+        <w:rPr>
+          <w:rFonts w:ascii="Times New Roman" w:hAnsi="Times New Roman"/>
+        </w:rPr>
+        <w:t>Саноат</w:t>
+      </w:r>
+      <w:proofErr w:type="spellEnd"/>
+      <w:proofErr w:type="gramEnd"/>
+      <w:r>
+        <w:rPr>
+          <w:rFonts w:ascii="Times New Roman" w:hAnsi="Times New Roman"/>
+        </w:rPr>
+        <w:t xml:space="preserve"> № 2                                          </w:t>
+      </w:r>
+      <w:proofErr w:type="spellStart"/>
+      <w:r>
+        <w:rPr>
+          <w:rFonts w:ascii="Times New Roman" w:hAnsi="Times New Roman"/>
+          <w:b/>
+          <w:color w:val="FF0000"/>
         </w:rPr>
         <w:t>Ферган</w:t>
       </w:r>
-      <w:r>
-        <w:rPr>
-          <w:rFonts w:ascii="Times New Roman" w:hAnsi="Times New Roman"/>
-          <w:b/>
+      <w:proofErr w:type="spellEnd"/>
+      <w:r>
+        <w:rPr>
+          <w:rFonts w:ascii="Times New Roman" w:hAnsi="Times New Roman"/>
+          <w:b/>
+          <w:color w:val="FF0000"/>
           <w:lang w:val="uz-Cyrl-UZ"/>
         </w:rPr>
         <w:t>ская область</w:t>
@@ -5032,6 +5646,7 @@
         <w:rPr>
           <w:rFonts w:ascii="Arial" w:hAnsi="Arial" w:cs="Arial"/>
           <w:b/>
+          <w:color w:val="FF0000"/>
           <w:lang w:val="uz-Latn-UZ"/>
         </w:rPr>
         <w:t>15.03.2024</w:t>
@@ -5040,6 +5655,7 @@
         <w:rPr>
           <w:rFonts w:ascii="Arial" w:hAnsi="Arial" w:cs="Arial"/>
           <w:b/>
+          <w:color w:val="FF0000"/>
         </w:rPr>
         <w:t>г</w:t>
       </w:r>
@@ -5085,130 +5701,6 @@
     </w:p>
     <w:p>
       <w:pPr>
-        <w:tabs>
-          <w:tab w:val="left" w:pos="8225"/>
-        </w:tabs>
-        <w:spacing w:after="0" w:line="240" w:lineRule="auto"/>
-        <w:jc w:val="both"/>
-        <w:rPr>
-          <w:rFonts w:ascii="Times New Roman" w:hAnsi="Times New Roman"/>
-          <w:b/>
-        </w:rPr>
-      </w:pPr>
-    </w:p>
-    <w:p>
-      <w:pPr>
-        <w:spacing w:after="0" w:line="240" w:lineRule="auto"/>
-        <w:jc w:val="both"/>
-        <w:rPr>
-          <w:rFonts w:ascii="Times New Roman" w:hAnsi="Times New Roman"/>
-          <w:b/>
-        </w:rPr>
-      </w:pPr>
-      <w:r>
-        <w:rPr>
-          <w:rFonts w:ascii="Times New Roman" w:hAnsi="Times New Roman"/>
-          <w:b/>
-        </w:rPr>
-        <w:t xml:space="preserve">       </w:t>
-      </w:r>
-    </w:p>
-    <w:p>
-      <w:pPr>
-        <w:spacing w:after="0" w:line="240" w:lineRule="auto"/>
-        <w:jc w:val="both"/>
-        <w:rPr>
-          <w:rFonts w:ascii="Times New Roman" w:hAnsi="Times New Roman"/>
-          <w:b/>
-        </w:rPr>
-      </w:pPr>
-      <w:r>
-        <w:rPr>
-          <w:rFonts w:ascii="Times New Roman" w:hAnsi="Times New Roman"/>
-          <w:b/>
-        </w:rPr>
-        <w:t xml:space="preserve">                      </w:t>
-      </w:r>
-      <w:r>
-        <w:rPr>
-          <w:rFonts w:ascii="Times New Roman" w:hAnsi="Times New Roman"/>
-          <w:b/>
-        </w:rPr>
-        <w:t xml:space="preserve">                          </w:t>
-      </w:r>
-      <w:r>
-        <w:rPr>
-          <w:rFonts w:ascii="Times New Roman" w:hAnsi="Times New Roman"/>
-          <w:b/>
-        </w:rPr>
-        <w:t xml:space="preserve">                                       </w:t>
-      </w:r>
-    </w:p>
-    <w:p>
-      <w:pPr>
-        <w:spacing w:after="0" w:line="240" w:lineRule="auto"/>
-        <w:jc w:val="both"/>
-        <w:rPr>
-          <w:rFonts w:ascii="Times New Roman" w:hAnsi="Times New Roman"/>
-        </w:rPr>
-      </w:pPr>
-      <w:r>
-        <w:rPr>
-          <w:rFonts w:ascii="Times New Roman" w:hAnsi="Times New Roman"/>
-        </w:rPr>
-        <w:t xml:space="preserve">                                                                        </w:t>
-      </w:r>
-      <w:r>
-        <w:rPr>
-          <w:rFonts w:ascii="Times New Roman" w:hAnsi="Times New Roman"/>
-        </w:rPr>
-        <w:t xml:space="preserve">        </w:t>
-      </w:r>
-      <w:r>
-        <w:rPr>
-          <w:rFonts w:ascii="Times New Roman" w:hAnsi="Times New Roman"/>
-        </w:rPr>
-        <w:t xml:space="preserve"> </w:t>
-      </w:r>
-      <w:r>
-        <w:rPr>
-          <w:rFonts w:ascii="Times New Roman" w:hAnsi="Times New Roman"/>
-        </w:rPr>
-        <w:t xml:space="preserve">        </w:t>
-      </w:r>
-      <w:r>
-        <w:rPr>
-          <w:rFonts w:ascii="Times New Roman" w:hAnsi="Times New Roman"/>
-        </w:rPr>
-        <w:t xml:space="preserve">          </w:t>
-      </w:r>
-      <w:r>
-        <w:rPr>
-          <w:rFonts w:ascii="Times New Roman" w:hAnsi="Times New Roman"/>
-        </w:rPr>
-        <w:t xml:space="preserve">                 </w:t>
-      </w:r>
-      <w:r>
-        <w:rPr>
-          <w:rFonts w:ascii="Times New Roman" w:hAnsi="Times New Roman"/>
-        </w:rPr>
-        <w:t xml:space="preserve">           </w:t>
-      </w:r>
-      <w:r>
-        <w:rPr>
-          <w:rFonts w:ascii="Times New Roman" w:hAnsi="Times New Roman"/>
-        </w:rPr>
-        <w:t xml:space="preserve"> </w:t>
-      </w:r>
-      <w:r>
-        <w:rPr>
-          <w:rFonts w:ascii="Times New Roman" w:hAnsi="Times New Roman"/>
-        </w:rPr>
-        <w:t xml:space="preserve">       </w:t>
-      </w:r>
-    </w:p>
-    <w:p>
-      <w:pPr>
         <w:spacing w:after="0" w:line="240" w:lineRule="auto"/>
         <w:jc w:val="both"/>
         <w:rPr>
@@ -5232,49 +5724,39 @@
           <w:rFonts w:ascii="Times New Roman" w:hAnsi="Times New Roman"/>
           <w:b/>
         </w:rPr>
-        <w:t>Ген. Директор :   ___________________________Б. Мамажонов.</w:t>
-      </w:r>
-    </w:p>
-    <w:p>
-      <w:pPr>
-        <w:spacing w:after="0" w:line="240" w:lineRule="auto"/>
-        <w:jc w:val="both"/>
-        <w:rPr>
-          <w:rFonts w:ascii="Times New Roman" w:hAnsi="Times New Roman"/>
-        </w:rPr>
-      </w:pPr>
-    </w:p>
-    <w:p>
-      <w:pPr>
-        <w:spacing w:after="0" w:line="240" w:lineRule="auto"/>
-        <w:jc w:val="both"/>
-        <w:rPr>
-          <w:rFonts w:ascii="Times New Roman" w:hAnsi="Times New Roman"/>
-        </w:rPr>
-      </w:pPr>
-    </w:p>
-    <w:p>
-      <w:pPr>
-        <w:spacing w:after="0" w:line="240" w:lineRule="auto"/>
-        <w:jc w:val="both"/>
-        <w:rPr>
-          <w:rFonts w:ascii="Times New Roman" w:hAnsi="Times New Roman"/>
-        </w:rPr>
-      </w:pPr>
-    </w:p>
-    <w:p>
-      <w:pPr>
-        <w:spacing w:after="0" w:line="240" w:lineRule="auto"/>
-        <w:jc w:val="both"/>
-        <w:rPr>
-          <w:rFonts w:ascii="Times New Roman" w:hAnsi="Times New Roman"/>
-        </w:rPr>
-      </w:pPr>
-      <w:r>
-        <w:rPr>
-          <w:rFonts w:ascii="Times New Roman" w:hAnsi="Times New Roman"/>
-        </w:rPr>
-        <w:t xml:space="preserve">                                                                                               </w:t>
+        <w:t xml:space="preserve">Ген. </w:t>
+      </w:r>
+      <w:proofErr w:type="gramStart"/>
+      <w:r>
+        <w:rPr>
+          <w:rFonts w:ascii="Times New Roman" w:hAnsi="Times New Roman"/>
+          <w:b/>
+        </w:rPr>
+        <w:t>Директор :</w:t>
+      </w:r>
+      <w:proofErr w:type="gramEnd"/>
+      <w:r>
+        <w:rPr>
+          <w:rFonts w:ascii="Times New Roman" w:hAnsi="Times New Roman"/>
+          <w:b/>
+        </w:rPr>
+        <w:t xml:space="preserve">   ___________________________Б. </w:t>
+      </w:r>
+      <w:proofErr w:type="spellStart"/>
+      <w:r>
+        <w:rPr>
+          <w:rFonts w:ascii="Times New Roman" w:hAnsi="Times New Roman"/>
+          <w:b/>
+        </w:rPr>
+        <w:t>Мамажонов</w:t>
+      </w:r>
+      <w:proofErr w:type="spellEnd"/>
+      <w:r>
+        <w:rPr>
+          <w:rFonts w:ascii="Times New Roman" w:hAnsi="Times New Roman"/>
+          <w:b/>
+        </w:rPr>
+        <w:t>.</w:t>
       </w:r>
     </w:p>
     <w:sectPr>
@@ -5288,7 +5770,7 @@
 </file>
 
 <file path=word/numbering.xml><?xml version="1.0" encoding="utf-8"?>
-<w:numbering xmlns:wpc="http://schemas.microsoft.com/office/word/2010/wordprocessingCanvas" xmlns:cx="http://schemas.microsoft.com/office/drawing/2014/chartex" xmlns:mc="http://schemas.openxmlformats.org/markup-compatibility/2006" xmlns:o="urn:schemas-microsoft-com:office:office" xmlns:r="http://schemas.openxmlformats.org/officeDocument/2006/relationships" xmlns:m="http://schemas.openxmlformats.org/officeDocument/2006/math" xmlns:v="urn:schemas-microsoft-com:vml" xmlns:wp14="http://schemas.microsoft.com/office/word/2010/wordprocessingDrawing" xmlns:wp="http://schemas.openxmlformats.org/drawingml/2006/wordprocessingDrawing" xmlns:w10="urn:schemas-microsoft-com:office:word" xmlns:w="http://schemas.openxmlformats.org/wordprocessingml/2006/main" xmlns:w14="http://schemas.microsoft.com/office/word/2010/wordml" xmlns:w15="http://schemas.microsoft.com/office/word/2012/wordml" xmlns:w16se="http://schemas.microsoft.com/office/word/2015/wordml/symex" xmlns:wpg="http://schemas.microsoft.com/office/word/2010/wordprocessingGroup" xmlns:wpi="http://schemas.microsoft.com/office/word/2010/wordprocessingInk" xmlns:wne="http://schemas.microsoft.com/office/word/2006/wordml" xmlns:wps="http://schemas.microsoft.com/office/word/2010/wordprocessingShape" mc:Ignorable="w14 w15 w16se wp14">
+<w:numbering xmlns:wpc="http://schemas.microsoft.com/office/word/2010/wordprocessingCanvas" xmlns:cx="http://schemas.microsoft.com/office/drawing/2014/chartex" xmlns:cx1="http://schemas.microsoft.com/office/drawing/2015/9/8/chartex" xmlns:cx2="http://schemas.microsoft.com/office/drawing/2015/10/21/chartex" xmlns:cx3="http://schemas.microsoft.com/office/drawing/2016/5/9/chartex" xmlns:cx4="http://schemas.microsoft.com/office/drawing/2016/5/10/chartex" xmlns:cx5="http://schemas.microsoft.com/office/drawing/2016/5/11/chartex" xmlns:cx6="http://schemas.microsoft.com/office/drawing/2016/5/12/chartex" xmlns:cx7="http://schemas.microsoft.com/office/drawing/2016/5/13/chartex" xmlns:cx8="http://schemas.microsoft.com/office/drawing/2016/5/14/chartex" xmlns:mc="http://schemas.openxmlformats.org/markup-compatibility/2006" xmlns:aink="http://schemas.microsoft.com/office/drawing/2016/ink" xmlns:am3d="http://schemas.microsoft.com/office/drawing/2017/model3d" xmlns:o="urn:schemas-microsoft-com:office:office" xmlns:r="http://schemas.openxmlformats.org/officeDocument/2006/relationships" xmlns:m="http://schemas.openxmlformats.org/officeDocument/2006/math" xmlns:v="urn:schemas-microsoft-com:vml" xmlns:wp14="http://schemas.microsoft.com/office/word/2010/wordprocessingDrawing" xmlns:wp="http://schemas.openxmlformats.org/drawingml/2006/wordprocessingDrawing" xmlns:w10="urn:schemas-microsoft-com:office:word" xmlns:w="http://schemas.openxmlformats.org/wordprocessingml/2006/main" xmlns:w14="http://schemas.microsoft.com/office/word/2010/wordml" xmlns:w15="http://schemas.microsoft.com/office/word/2012/wordml" xmlns:w16cex="http://schemas.microsoft.com/office/word/2018/wordml/cex" xmlns:w16cid="http://schemas.microsoft.com/office/word/2016/wordml/cid" xmlns:w16="http://schemas.microsoft.com/office/word/2018/wordml" xmlns:w16se="http://schemas.microsoft.com/office/word/2015/wordml/symex" xmlns:wpg="http://schemas.microsoft.com/office/word/2010/wordprocessingGroup" xmlns:wpi="http://schemas.microsoft.com/office/word/2010/wordprocessingInk" xmlns:wne="http://schemas.microsoft.com/office/word/2006/wordml" xmlns:wps="http://schemas.microsoft.com/office/word/2010/wordprocessingShape" mc:Ignorable="w14 w15 w16se w16cid w16 w16cex wp14">
   <w:abstractNum w:abstractNumId="0" w15:restartNumberingAfterBreak="0">
     <w:nsid w:val="32120A60"/>
     <w:multiLevelType w:val="multilevel"/>
@@ -5417,7 +5899,7 @@
 </file>
 
 <file path=word/styles.xml><?xml version="1.0" encoding="utf-8"?>
-<w:styles xmlns:mc="http://schemas.openxmlformats.org/markup-compatibility/2006" xmlns:r="http://schemas.openxmlformats.org/officeDocument/2006/relationships" xmlns:w="http://schemas.openxmlformats.org/wordprocessingml/2006/main" xmlns:w14="http://schemas.microsoft.com/office/word/2010/wordml" xmlns:w15="http://schemas.microsoft.com/office/word/2012/wordml" xmlns:w16se="http://schemas.microsoft.com/office/word/2015/wordml/symex" mc:Ignorable="w14 w15 w16se">
+<w:styles xmlns:mc="http://schemas.openxmlformats.org/markup-compatibility/2006" xmlns:r="http://schemas.openxmlformats.org/officeDocument/2006/relationships" xmlns:w="http://schemas.openxmlformats.org/wordprocessingml/2006/main" xmlns:w14="http://schemas.microsoft.com/office/word/2010/wordml" xmlns:w15="http://schemas.microsoft.com/office/word/2012/wordml" xmlns:w16cex="http://schemas.microsoft.com/office/word/2018/wordml/cex" xmlns:w16cid="http://schemas.microsoft.com/office/word/2016/wordml/cid" xmlns:w16="http://schemas.microsoft.com/office/word/2018/wordml" xmlns:w16se="http://schemas.microsoft.com/office/word/2015/wordml/symex" mc:Ignorable="w14 w15 w16se w16cid w16 w16cex">
   <w:docDefaults>
     <w:rPrDefault>
       <w:rPr>
@@ -5433,7 +5915,7 @@
       </w:pPr>
     </w:pPrDefault>
   </w:docDefaults>
-  <w:latentStyles w:defLockedState="0" w:defUIPriority="99" w:defSemiHidden="0" w:defUnhideWhenUsed="0" w:defQFormat="0" w:count="371">
+  <w:latentStyles w:defLockedState="0" w:defUIPriority="99" w:defSemiHidden="0" w:defUnhideWhenUsed="0" w:defQFormat="0" w:count="376">
     <w:lsdException w:name="Normal" w:uiPriority="0" w:qFormat="1"/>
     <w:lsdException w:name="heading 1" w:uiPriority="9" w:qFormat="1"/>
     <w:lsdException w:name="heading 2" w:semiHidden="1" w:uiPriority="9" w:unhideWhenUsed="1" w:qFormat="1"/>
@@ -5805,6 +6287,11 @@
     <w:lsdException w:name="List Table 5 Dark Accent 6" w:uiPriority="50"/>
     <w:lsdException w:name="List Table 6 Colorful Accent 6" w:uiPriority="51"/>
     <w:lsdException w:name="List Table 7 Colorful Accent 6" w:uiPriority="52"/>
+    <w:lsdException w:name="Mention" w:semiHidden="1" w:unhideWhenUsed="1"/>
+    <w:lsdException w:name="Smart Hyperlink" w:semiHidden="1" w:unhideWhenUsed="1"/>
+    <w:lsdException w:name="Hashtag" w:semiHidden="1" w:unhideWhenUsed="1"/>
+    <w:lsdException w:name="Unresolved Mention" w:semiHidden="1" w:unhideWhenUsed="1"/>
+    <w:lsdException w:name="Smart Link" w:semiHidden="1" w:unhideWhenUsed="1"/>
   </w:latentStyles>
   <w:style w:type="paragraph" w:default="1" w:styleId="a">
     <w:name w:val="Normal"/>

</xml_diff>